<commit_message>
add open to line...
</commit_message>
<xml_diff>
--- a/public/docs/reidcollins.docx
+++ b/public/docs/reidcollins.docx
@@ -28,7 +28,49 @@
           <w:rtl w:val="0"/>
           <w:lang w:val="nl-NL"/>
         </w:rPr>
-        <w:t>Brooklyn, NY | hire.reid.collins@gmail.com | linkedin.com/in/reidcollins</w:t>
+        <w:t xml:space="preserve">Brooklyn, NY | hire.reid.collins@gmail.com | </w:t>
+      </w:r>
+      <w:r>
+        <w:rPr>
+          <w:rStyle w:val="Hyperlink.0"/>
+        </w:rPr>
+        <w:fldChar w:fldCharType="begin" w:fldLock="0"/>
+      </w:r>
+      <w:r>
+        <w:rPr>
+          <w:rStyle w:val="Hyperlink.0"/>
+        </w:rPr>
+        <w:instrText xml:space="preserve"> HYPERLINK "http://linkedin.com/in/reidcollins"</w:instrText>
+      </w:r>
+      <w:r>
+        <w:rPr>
+          <w:rStyle w:val="Hyperlink.0"/>
+        </w:rPr>
+        <w:fldChar w:fldCharType="separate" w:fldLock="0"/>
+      </w:r>
+      <w:r>
+        <w:rPr>
+          <w:rStyle w:val="Hyperlink.0"/>
+          <w:rtl w:val="0"/>
+          <w:lang w:val="nl-NL"/>
+        </w:rPr>
+        <w:t>linkedin.com/in/reidcollins</w:t>
+      </w:r>
+      <w:r>
+        <w:rPr/>
+        <w:fldChar w:fldCharType="end" w:fldLock="0"/>
+      </w:r>
+    </w:p>
+    <w:p>
+      <w:pPr>
+        <w:pStyle w:val="Body A"/>
+      </w:pPr>
+      <w:r>
+        <w:rPr>
+          <w:rtl w:val="0"/>
+          <w:lang w:val="nl-NL"/>
+        </w:rPr>
+        <w:t>Open to Senior Technical Program Manager, Platform, and Infrastructure roles</w:t>
       </w:r>
     </w:p>
     <w:p>
@@ -743,9 +785,6 @@
       <w:pPr>
         <w:pStyle w:val="Body A"/>
         <w:spacing w:after="40"/>
-        <w:rPr>
-          <w:lang w:val="nl-NL"/>
-        </w:rPr>
       </w:pPr>
       <w:r>
         <w:rPr>
@@ -797,26 +836,6 @@
           <w:lang w:val="nl-NL"/>
         </w:rPr>
         <w:t>2015</w:t>
-      </w:r>
-    </w:p>
-    <w:p>
-      <w:pPr>
-        <w:pStyle w:val="List Bullet"/>
-        <w:numPr>
-          <w:ilvl w:val="0"/>
-          <w:numId w:val="3"/>
-        </w:numPr>
-        <w:spacing w:after="0"/>
-        <w:rPr>
-          <w:lang w:val="en-US"/>
-        </w:rPr>
-      </w:pPr>
-      <w:r>
-        <w:rPr>
-          <w:rtl w:val="0"/>
-          <w:lang w:val="nl-NL"/>
-        </w:rPr>
-        <w:t>Scrum master and developer for Cheetahmail development team</w:t>
       </w:r>
     </w:p>
     <w:p>
@@ -832,15 +851,15 @@
         <w:jc w:val="left"/>
         <w:rPr>
           <w:rtl w:val="0"/>
-          <w:lang w:val="en-US"/>
-        </w:rPr>
-      </w:pPr>
-      <w:r>
-        <w:rPr>
-          <w:rtl w:val="0"/>
-          <w:lang w:val="en-US"/>
-        </w:rPr>
-        <w:t>Improved reporting performance by implementing bulk data loading solutions using SQL*Loader for high-volume datasets</w:t>
+          <w:lang w:val="nl-NL"/>
+        </w:rPr>
+      </w:pPr>
+      <w:r>
+        <w:rPr>
+          <w:rtl w:val="0"/>
+          <w:lang w:val="nl-NL"/>
+        </w:rPr>
+        <w:t>Scrum master and developer for Cheetahmail development team</w:t>
       </w:r>
     </w:p>
     <w:p>
@@ -864,7 +883,7 @@
           <w:rtl w:val="0"/>
           <w:lang w:val="en-US"/>
         </w:rPr>
-        <w:t>Built ETL pipelines for client data ingestion (text/XML) into BerkeleyDB/CDB systems and supported API integrations</w:t>
+        <w:t>Improved reporting performance by implementing bulk data loading solutions using SQL*Loader for high-volume datasets</w:t>
       </w:r>
     </w:p>
     <w:p>
@@ -874,6 +893,30 @@
           <w:ilvl w:val="0"/>
           <w:numId w:val="2"/>
         </w:numPr>
+        <w:bidi w:val="0"/>
+        <w:spacing w:after="0"/>
+        <w:ind w:right="0"/>
+        <w:jc w:val="left"/>
+        <w:rPr>
+          <w:rtl w:val="0"/>
+          <w:lang w:val="en-US"/>
+        </w:rPr>
+      </w:pPr>
+      <w:r>
+        <w:rPr>
+          <w:rtl w:val="0"/>
+          <w:lang w:val="en-US"/>
+        </w:rPr>
+        <w:t>Built ETL pipelines for client data ingestion (text/XML) into BerkeleyDB/CDB systems and supported API integrations</w:t>
+      </w:r>
+    </w:p>
+    <w:p>
+      <w:pPr>
+        <w:pStyle w:val="List Bullet"/>
+        <w:numPr>
+          <w:ilvl w:val="0"/>
+          <w:numId w:val="2"/>
+        </w:numPr>
         <w:spacing w:after="0"/>
       </w:pPr>
     </w:p>
@@ -1015,37 +1058,17 @@
     </w:p>
     <w:p>
       <w:pPr>
-        <w:pStyle w:val="Body"/>
-        <w:spacing w:line="276" w:lineRule="auto"/>
-      </w:pPr>
-      <w:r>
-        <w:rPr>
-          <w:rFonts w:ascii="Calibri" w:hAnsi="Calibri"/>
+        <w:pStyle w:val="Body A"/>
+        <w:spacing w:after="0"/>
+      </w:pPr>
+      <w:r>
+        <w:rPr>
           <w:sz w:val="22"/>
           <w:szCs w:val="22"/>
           <w:rtl w:val="0"/>
           <w:lang w:val="en-US"/>
         </w:rPr>
-        <w:t>Certifications: Certified Scrum</w:t>
-      </w:r>
-      <w:r>
-        <w:rPr>
-          <w:rFonts w:ascii="Calibri" w:hAnsi="Calibri"/>
-          <w:sz w:val="22"/>
-          <w:szCs w:val="22"/>
-          <w:rtl w:val="0"/>
-          <w:lang w:val="en-US"/>
-        </w:rPr>
-        <w:t xml:space="preserve"> </w:t>
-      </w:r>
-      <w:r>
-        <w:rPr>
-          <w:rFonts w:ascii="Calibri" w:hAnsi="Calibri"/>
-          <w:sz w:val="22"/>
-          <w:szCs w:val="22"/>
-          <w:rtl w:val="0"/>
-        </w:rPr>
-        <w:t>Master (CSM)</w:t>
+        <w:t>Certifications: Certified Scrum Master (CSM)</w:t>
       </w:r>
     </w:p>
     <w:sectPr>
@@ -1395,324 +1418,6 @@
   </w:num>
   <w:num w:numId="2">
     <w:abstractNumId w:val="0"/>
-  </w:num>
-  <w:num w:numId="3">
-    <w:abstractNumId w:val="0"/>
-    <w:lvlOverride w:ilvl="0">
-      <w:lvl w:ilvl="0">
-        <w:start w:val="1"/>
-        <w:numFmt w:val="bullet"/>
-        <w:suff w:val="tab"/>
-        <w:lvlText w:val="·"/>
-        <w:lvlJc w:val="left"/>
-        <w:pPr>
-          <w:tabs>
-            <w:tab w:val="clear" w:pos="360"/>
-          </w:tabs>
-          <w:ind w:left="360" w:hanging="360"/>
-        </w:pPr>
-        <w:rPr>
-          <w:rFonts w:ascii="Symbol" w:cs="Symbol" w:hAnsi="Symbol" w:eastAsia="Symbol"/>
-          <w:b w:val="0"/>
-          <w:bCs w:val="0"/>
-          <w:i w:val="0"/>
-          <w:iCs w:val="0"/>
-          <w:caps w:val="0"/>
-          <w:smallCaps w:val="0"/>
-          <w:strike w:val="0"/>
-          <w:dstrike w:val="0"/>
-          <w:outline w:val="0"/>
-          <w:emboss w:val="0"/>
-          <w:imprint w:val="0"/>
-          <w:spacing w:val="0"/>
-          <w:w w:val="100"/>
-          <w:kern w:val="0"/>
-          <w:position w:val="0"/>
-          <w:highlight w:val="none"/>
-          <w:vertAlign w:val="baseline"/>
-        </w:rPr>
-      </w:lvl>
-    </w:lvlOverride>
-    <w:lvlOverride w:ilvl="1">
-      <w:lvl w:ilvl="1">
-        <w:start w:val="1"/>
-        <w:numFmt w:val="bullet"/>
-        <w:suff w:val="tab"/>
-        <w:lvlText w:val="·"/>
-        <w:lvlJc w:val="left"/>
-        <w:pPr>
-          <w:tabs>
-            <w:tab w:val="clear" w:pos="360"/>
-          </w:tabs>
-          <w:ind w:left="360" w:hanging="360"/>
-        </w:pPr>
-        <w:rPr>
-          <w:rFonts w:ascii="Symbol" w:cs="Symbol" w:hAnsi="Symbol" w:eastAsia="Symbol"/>
-          <w:b w:val="0"/>
-          <w:bCs w:val="0"/>
-          <w:i w:val="0"/>
-          <w:iCs w:val="0"/>
-          <w:caps w:val="0"/>
-          <w:smallCaps w:val="0"/>
-          <w:strike w:val="0"/>
-          <w:dstrike w:val="0"/>
-          <w:outline w:val="0"/>
-          <w:emboss w:val="0"/>
-          <w:imprint w:val="0"/>
-          <w:spacing w:val="0"/>
-          <w:w w:val="100"/>
-          <w:kern w:val="0"/>
-          <w:position w:val="0"/>
-          <w:highlight w:val="none"/>
-          <w:vertAlign w:val="baseline"/>
-        </w:rPr>
-      </w:lvl>
-    </w:lvlOverride>
-    <w:lvlOverride w:ilvl="2">
-      <w:lvl w:ilvl="2">
-        <w:start w:val="1"/>
-        <w:numFmt w:val="bullet"/>
-        <w:suff w:val="tab"/>
-        <w:lvlText w:val="·"/>
-        <w:lvlJc w:val="left"/>
-        <w:pPr>
-          <w:tabs>
-            <w:tab w:val="clear" w:pos="360"/>
-          </w:tabs>
-          <w:ind w:left="360" w:hanging="360"/>
-        </w:pPr>
-        <w:rPr>
-          <w:rFonts w:ascii="Symbol" w:cs="Symbol" w:hAnsi="Symbol" w:eastAsia="Symbol"/>
-          <w:b w:val="0"/>
-          <w:bCs w:val="0"/>
-          <w:i w:val="0"/>
-          <w:iCs w:val="0"/>
-          <w:caps w:val="0"/>
-          <w:smallCaps w:val="0"/>
-          <w:strike w:val="0"/>
-          <w:dstrike w:val="0"/>
-          <w:outline w:val="0"/>
-          <w:emboss w:val="0"/>
-          <w:imprint w:val="0"/>
-          <w:spacing w:val="0"/>
-          <w:w w:val="100"/>
-          <w:kern w:val="0"/>
-          <w:position w:val="0"/>
-          <w:highlight w:val="none"/>
-          <w:vertAlign w:val="baseline"/>
-        </w:rPr>
-      </w:lvl>
-    </w:lvlOverride>
-    <w:lvlOverride w:ilvl="3">
-      <w:lvl w:ilvl="3">
-        <w:start w:val="1"/>
-        <w:numFmt w:val="bullet"/>
-        <w:suff w:val="tab"/>
-        <w:lvlText w:val="·"/>
-        <w:lvlJc w:val="left"/>
-        <w:pPr>
-          <w:tabs>
-            <w:tab w:val="clear" w:pos="360"/>
-          </w:tabs>
-          <w:ind w:left="360" w:hanging="360"/>
-        </w:pPr>
-        <w:rPr>
-          <w:rFonts w:ascii="Symbol" w:cs="Symbol" w:hAnsi="Symbol" w:eastAsia="Symbol"/>
-          <w:b w:val="0"/>
-          <w:bCs w:val="0"/>
-          <w:i w:val="0"/>
-          <w:iCs w:val="0"/>
-          <w:caps w:val="0"/>
-          <w:smallCaps w:val="0"/>
-          <w:strike w:val="0"/>
-          <w:dstrike w:val="0"/>
-          <w:outline w:val="0"/>
-          <w:emboss w:val="0"/>
-          <w:imprint w:val="0"/>
-          <w:spacing w:val="0"/>
-          <w:w w:val="100"/>
-          <w:kern w:val="0"/>
-          <w:position w:val="0"/>
-          <w:highlight w:val="none"/>
-          <w:vertAlign w:val="baseline"/>
-        </w:rPr>
-      </w:lvl>
-    </w:lvlOverride>
-    <w:lvlOverride w:ilvl="4">
-      <w:lvl w:ilvl="4">
-        <w:start w:val="1"/>
-        <w:numFmt w:val="bullet"/>
-        <w:suff w:val="tab"/>
-        <w:lvlText w:val="·"/>
-        <w:lvlJc w:val="left"/>
-        <w:pPr>
-          <w:tabs>
-            <w:tab w:val="clear" w:pos="360"/>
-          </w:tabs>
-          <w:ind w:left="360" w:hanging="360"/>
-        </w:pPr>
-        <w:rPr>
-          <w:rFonts w:ascii="Symbol" w:cs="Symbol" w:hAnsi="Symbol" w:eastAsia="Symbol"/>
-          <w:b w:val="0"/>
-          <w:bCs w:val="0"/>
-          <w:i w:val="0"/>
-          <w:iCs w:val="0"/>
-          <w:caps w:val="0"/>
-          <w:smallCaps w:val="0"/>
-          <w:strike w:val="0"/>
-          <w:dstrike w:val="0"/>
-          <w:outline w:val="0"/>
-          <w:emboss w:val="0"/>
-          <w:imprint w:val="0"/>
-          <w:spacing w:val="0"/>
-          <w:w w:val="100"/>
-          <w:kern w:val="0"/>
-          <w:position w:val="0"/>
-          <w:highlight w:val="none"/>
-          <w:vertAlign w:val="baseline"/>
-        </w:rPr>
-      </w:lvl>
-    </w:lvlOverride>
-    <w:lvlOverride w:ilvl="5">
-      <w:lvl w:ilvl="5">
-        <w:start w:val="1"/>
-        <w:numFmt w:val="bullet"/>
-        <w:suff w:val="tab"/>
-        <w:lvlText w:val="·"/>
-        <w:lvlJc w:val="left"/>
-        <w:pPr>
-          <w:tabs>
-            <w:tab w:val="clear" w:pos="360"/>
-          </w:tabs>
-          <w:ind w:left="360" w:hanging="360"/>
-        </w:pPr>
-        <w:rPr>
-          <w:rFonts w:ascii="Symbol" w:cs="Symbol" w:hAnsi="Symbol" w:eastAsia="Symbol"/>
-          <w:b w:val="0"/>
-          <w:bCs w:val="0"/>
-          <w:i w:val="0"/>
-          <w:iCs w:val="0"/>
-          <w:caps w:val="0"/>
-          <w:smallCaps w:val="0"/>
-          <w:strike w:val="0"/>
-          <w:dstrike w:val="0"/>
-          <w:outline w:val="0"/>
-          <w:emboss w:val="0"/>
-          <w:imprint w:val="0"/>
-          <w:spacing w:val="0"/>
-          <w:w w:val="100"/>
-          <w:kern w:val="0"/>
-          <w:position w:val="0"/>
-          <w:highlight w:val="none"/>
-          <w:vertAlign w:val="baseline"/>
-        </w:rPr>
-      </w:lvl>
-    </w:lvlOverride>
-    <w:lvlOverride w:ilvl="6">
-      <w:lvl w:ilvl="6">
-        <w:start w:val="1"/>
-        <w:numFmt w:val="bullet"/>
-        <w:suff w:val="tab"/>
-        <w:lvlText w:val="·"/>
-        <w:lvlJc w:val="left"/>
-        <w:pPr>
-          <w:tabs>
-            <w:tab w:val="clear" w:pos="360"/>
-          </w:tabs>
-          <w:ind w:left="360" w:hanging="360"/>
-        </w:pPr>
-        <w:rPr>
-          <w:rFonts w:ascii="Symbol" w:cs="Symbol" w:hAnsi="Symbol" w:eastAsia="Symbol"/>
-          <w:b w:val="0"/>
-          <w:bCs w:val="0"/>
-          <w:i w:val="0"/>
-          <w:iCs w:val="0"/>
-          <w:caps w:val="0"/>
-          <w:smallCaps w:val="0"/>
-          <w:strike w:val="0"/>
-          <w:dstrike w:val="0"/>
-          <w:outline w:val="0"/>
-          <w:emboss w:val="0"/>
-          <w:imprint w:val="0"/>
-          <w:spacing w:val="0"/>
-          <w:w w:val="100"/>
-          <w:kern w:val="0"/>
-          <w:position w:val="0"/>
-          <w:highlight w:val="none"/>
-          <w:vertAlign w:val="baseline"/>
-        </w:rPr>
-      </w:lvl>
-    </w:lvlOverride>
-    <w:lvlOverride w:ilvl="7">
-      <w:lvl w:ilvl="7">
-        <w:start w:val="1"/>
-        <w:numFmt w:val="bullet"/>
-        <w:suff w:val="tab"/>
-        <w:lvlText w:val="·"/>
-        <w:lvlJc w:val="left"/>
-        <w:pPr>
-          <w:tabs>
-            <w:tab w:val="clear" w:pos="360"/>
-          </w:tabs>
-          <w:ind w:left="360" w:hanging="360"/>
-        </w:pPr>
-        <w:rPr>
-          <w:rFonts w:ascii="Symbol" w:cs="Symbol" w:hAnsi="Symbol" w:eastAsia="Symbol"/>
-          <w:b w:val="0"/>
-          <w:bCs w:val="0"/>
-          <w:i w:val="0"/>
-          <w:iCs w:val="0"/>
-          <w:caps w:val="0"/>
-          <w:smallCaps w:val="0"/>
-          <w:strike w:val="0"/>
-          <w:dstrike w:val="0"/>
-          <w:outline w:val="0"/>
-          <w:emboss w:val="0"/>
-          <w:imprint w:val="0"/>
-          <w:spacing w:val="0"/>
-          <w:w w:val="100"/>
-          <w:kern w:val="0"/>
-          <w:position w:val="0"/>
-          <w:highlight w:val="none"/>
-          <w:vertAlign w:val="baseline"/>
-        </w:rPr>
-      </w:lvl>
-    </w:lvlOverride>
-    <w:lvlOverride w:ilvl="8">
-      <w:lvl w:ilvl="8">
-        <w:start w:val="1"/>
-        <w:numFmt w:val="bullet"/>
-        <w:suff w:val="tab"/>
-        <w:lvlText w:val="·"/>
-        <w:lvlJc w:val="left"/>
-        <w:pPr>
-          <w:tabs>
-            <w:tab w:val="clear" w:pos="360"/>
-          </w:tabs>
-          <w:ind w:left="360" w:hanging="360"/>
-        </w:pPr>
-        <w:rPr>
-          <w:rFonts w:ascii="Symbol" w:cs="Symbol" w:hAnsi="Symbol" w:eastAsia="Symbol"/>
-          <w:b w:val="0"/>
-          <w:bCs w:val="0"/>
-          <w:i w:val="0"/>
-          <w:iCs w:val="0"/>
-          <w:caps w:val="0"/>
-          <w:smallCaps w:val="0"/>
-          <w:strike w:val="0"/>
-          <w:dstrike w:val="0"/>
-          <w:outline w:val="0"/>
-          <w:emboss w:val="0"/>
-          <w:imprint w:val="0"/>
-          <w:spacing w:val="0"/>
-          <w:w w:val="100"/>
-          <w:kern w:val="0"/>
-          <w:position w:val="0"/>
-          <w:highlight w:val="none"/>
-          <w:vertAlign w:val="baseline"/>
-        </w:rPr>
-      </w:lvl>
-    </w:lvlOverride>
   </w:num>
 </w:numbering>
 </file>
@@ -1921,6 +1626,21 @@
       </w14:textFill>
     </w:rPr>
   </w:style>
+  <w:style w:type="character" w:styleId="Hyperlink.0">
+    <w:name w:val="Hyperlink.0"/>
+    <w:basedOn w:val="Hyperlink"/>
+    <w:next w:val="Hyperlink.0"/>
+    <w:rPr>
+      <w:outline w:val="0"/>
+      <w:color w:val="0000ff"/>
+      <w:u w:val="single" w:color="0000ff"/>
+      <w14:textFill>
+        <w14:solidFill>
+          <w14:srgbClr w14:val="0000FF"/>
+        </w14:solidFill>
+      </w14:textFill>
+    </w:rPr>
+  </w:style>
   <w:style w:type="paragraph" w:styleId="List Bullet">
     <w:name w:val="List Bullet"/>
     <w:next w:val="List Bullet"/>
@@ -1975,53 +1695,6 @@
         <w:numId w:val="1"/>
       </w:numPr>
     </w:pPr>
-  </w:style>
-  <w:style w:type="paragraph" w:styleId="Body">
-    <w:name w:val="Body"/>
-    <w:next w:val="Body"/>
-    <w:pPr>
-      <w:keepNext w:val="0"/>
-      <w:keepLines w:val="0"/>
-      <w:pageBreakBefore w:val="0"/>
-      <w:widowControl w:val="1"/>
-      <w:shd w:val="clear" w:color="auto" w:fill="auto"/>
-      <w:suppressAutoHyphens w:val="0"/>
-      <w:bidi w:val="0"/>
-      <w:spacing w:before="0" w:after="0" w:line="240" w:lineRule="auto"/>
-      <w:ind w:left="0" w:right="0" w:firstLine="0"/>
-      <w:jc w:val="left"/>
-      <w:outlineLvl w:val="9"/>
-    </w:pPr>
-    <w:rPr>
-      <w:rFonts w:ascii="Times New Roman" w:cs="Arial Unicode MS" w:hAnsi="Times New Roman" w:eastAsia="Arial Unicode MS"/>
-      <w:b w:val="0"/>
-      <w:bCs w:val="0"/>
-      <w:i w:val="0"/>
-      <w:iCs w:val="0"/>
-      <w:caps w:val="0"/>
-      <w:smallCaps w:val="0"/>
-      <w:strike w:val="0"/>
-      <w:dstrike w:val="0"/>
-      <w:outline w:val="0"/>
-      <w:color w:val="000000"/>
-      <w:spacing w:val="0"/>
-      <w:kern w:val="0"/>
-      <w:position w:val="0"/>
-      <w:sz w:val="24"/>
-      <w:szCs w:val="24"/>
-      <w:u w:val="none" w:color="000000"/>
-      <w:shd w:val="nil" w:color="auto" w:fill="auto"/>
-      <w:vertAlign w:val="baseline"/>
-      <w:lang w:val="en-US"/>
-      <w14:textOutline>
-        <w14:noFill/>
-      </w14:textOutline>
-      <w14:textFill>
-        <w14:solidFill>
-          <w14:srgbClr w14:val="000000"/>
-        </w14:solidFill>
-      </w14:textFill>
-    </w:rPr>
   </w:style>
 </w:styles>
 </file>

</xml_diff>

<commit_message>
slight change to the resume
</commit_message>
<xml_diff>
--- a/public/docs/reidcollins.docx
+++ b/public/docs/reidcollins.docx
@@ -25,6 +25,7 @@
       </w:pPr>
       <w:r>
         <w:rPr>
+          <w:rStyle w:val="None B A"/>
           <w:rtl w:val="0"/>
           <w:lang w:val="nl-NL"/>
         </w:rPr>
@@ -33,33 +34,140 @@
       <w:r>
         <w:rPr>
           <w:rStyle w:val="Hyperlink.0"/>
+          <w:outline w:val="0"/>
+          <w:color w:val="0000ff"/>
+          <w:u w:val="single" w:color="0000ff"/>
+          <w:lang w:val="en-US"/>
+          <w14:textFill>
+            <w14:solidFill>
+              <w14:srgbClr w14:val="0000FF"/>
+            </w14:solidFill>
+          </w14:textFill>
         </w:rPr>
         <w:fldChar w:fldCharType="begin" w:fldLock="0"/>
       </w:r>
       <w:r>
         <w:rPr>
           <w:rStyle w:val="Hyperlink.0"/>
-        </w:rPr>
-        <w:instrText xml:space="preserve"> HYPERLINK "http://linkedin.com/in/reidcollins"</w:instrText>
+          <w:outline w:val="0"/>
+          <w:color w:val="0000ff"/>
+          <w:u w:val="single" w:color="0000ff"/>
+          <w:lang w:val="en-US"/>
+          <w14:textFill>
+            <w14:solidFill>
+              <w14:srgbClr w14:val="0000FF"/>
+            </w14:solidFill>
+          </w14:textFill>
+        </w:rPr>
+        <w:instrText xml:space="preserve"> HYPERLINK "https://www.hihelloreid.com"</w:instrText>
       </w:r>
       <w:r>
         <w:rPr>
           <w:rStyle w:val="Hyperlink.0"/>
+          <w:outline w:val="0"/>
+          <w:color w:val="0000ff"/>
+          <w:u w:val="single" w:color="0000ff"/>
+          <w:lang w:val="en-US"/>
+          <w14:textFill>
+            <w14:solidFill>
+              <w14:srgbClr w14:val="0000FF"/>
+            </w14:solidFill>
+          </w14:textFill>
         </w:rPr>
         <w:fldChar w:fldCharType="separate" w:fldLock="0"/>
       </w:r>
       <w:r>
         <w:rPr>
           <w:rStyle w:val="Hyperlink.0"/>
-          <w:rtl w:val="0"/>
-          <w:lang w:val="nl-NL"/>
-        </w:rPr>
-        <w:t>linkedin.com/in/reidcollins</w:t>
+          <w:outline w:val="0"/>
+          <w:color w:val="0000ff"/>
+          <w:u w:val="single" w:color="0000ff"/>
+          <w:rtl w:val="0"/>
+          <w:lang w:val="en-US"/>
+          <w14:textFill>
+            <w14:solidFill>
+              <w14:srgbClr w14:val="0000FF"/>
+            </w14:solidFill>
+          </w14:textFill>
+        </w:rPr>
+        <w:t>hihellloreid.com</w:t>
       </w:r>
       <w:r>
         <w:rPr/>
         <w:fldChar w:fldCharType="end" w:fldLock="0"/>
       </w:r>
+      <w:r>
+        <w:rPr>
+          <w:rtl w:val="0"/>
+          <w:lang w:val="en-US"/>
+        </w:rPr>
+        <w:t xml:space="preserve"> | </w:t>
+      </w:r>
+      <w:r>
+        <w:rPr>
+          <w:rStyle w:val="Hyperlink.1"/>
+          <w:outline w:val="0"/>
+          <w:color w:val="0000ff"/>
+          <w:u w:val="single" w:color="0000ff"/>
+          <w:lang w:val="nl-NL"/>
+          <w14:textFill>
+            <w14:solidFill>
+              <w14:srgbClr w14:val="0000FF"/>
+            </w14:solidFill>
+          </w14:textFill>
+        </w:rPr>
+        <w:fldChar w:fldCharType="begin" w:fldLock="0"/>
+      </w:r>
+      <w:r>
+        <w:rPr>
+          <w:rStyle w:val="Hyperlink.1"/>
+          <w:outline w:val="0"/>
+          <w:color w:val="0000ff"/>
+          <w:u w:val="single" w:color="0000ff"/>
+          <w:lang w:val="nl-NL"/>
+          <w14:textFill>
+            <w14:solidFill>
+              <w14:srgbClr w14:val="0000FF"/>
+            </w14:solidFill>
+          </w14:textFill>
+        </w:rPr>
+        <w:instrText xml:space="preserve"> HYPERLINK "http://linkedin.com/in/reidcollins"</w:instrText>
+      </w:r>
+      <w:r>
+        <w:rPr>
+          <w:rStyle w:val="Hyperlink.1"/>
+          <w:outline w:val="0"/>
+          <w:color w:val="0000ff"/>
+          <w:u w:val="single" w:color="0000ff"/>
+          <w:lang w:val="nl-NL"/>
+          <w14:textFill>
+            <w14:solidFill>
+              <w14:srgbClr w14:val="0000FF"/>
+            </w14:solidFill>
+          </w14:textFill>
+        </w:rPr>
+        <w:fldChar w:fldCharType="separate" w:fldLock="0"/>
+      </w:r>
+      <w:r>
+        <w:rPr>
+          <w:rStyle w:val="Hyperlink.1"/>
+          <w:outline w:val="0"/>
+          <w:color w:val="0000ff"/>
+          <w:u w:val="single" w:color="0000ff"/>
+          <w:rtl w:val="0"/>
+          <w:lang w:val="nl-NL"/>
+          <w14:textFill>
+            <w14:solidFill>
+              <w14:srgbClr w14:val="0000FF"/>
+            </w14:solidFill>
+          </w14:textFill>
+        </w:rPr>
+        <w:t>linkedin.com/in/reidcollins</w:t>
+      </w:r>
+      <w:r>
+        <w:rPr/>
+        <w:fldChar w:fldCharType="end" w:fldLock="0"/>
+      </w:r>
     </w:p>
     <w:p>
       <w:pPr>
@@ -67,8 +175,8 @@
       </w:pPr>
       <w:r>
         <w:rPr>
-          <w:rtl w:val="0"/>
-          <w:lang w:val="nl-NL"/>
+          <w:rStyle w:val="None B"/>
+          <w:rtl w:val="0"/>
         </w:rPr>
         <w:t>Open to Senior Technical Program Manager, Platform, and Infrastructure roles</w:t>
       </w:r>
@@ -78,11 +186,13 @@
         <w:pStyle w:val="Body A"/>
         <w:spacing w:before="120" w:after="40"/>
         <w:rPr>
-          <w:lang w:val="en-US"/>
-        </w:rPr>
-      </w:pPr>
-      <w:r>
-        <w:rPr>
+          <w:rStyle w:val="None"/>
+          <w:lang w:val="en-US"/>
+        </w:rPr>
+      </w:pPr>
+      <w:r>
+        <w:rPr>
+          <w:rStyle w:val="None"/>
           <w:b w:val="1"/>
           <w:bCs w:val="1"/>
           <w:sz w:val="26"/>
@@ -98,15 +208,17 @@
         <w:pStyle w:val="Body A"/>
         <w:spacing w:after="0"/>
         <w:rPr>
-          <w:lang w:val="en-US"/>
-        </w:rPr>
-      </w:pPr>
-      <w:r>
-        <w:rPr>
-          <w:rtl w:val="0"/>
-          <w:lang w:val="en-US"/>
-        </w:rPr>
-        <w:t>Senior Technical Program Manager with a hybrid background in software engineering and program leadership. Proven track record of driving large-scale platform migrations, leading cross-functional initiatives, and delivering production systems on AWS.</w:t>
+          <w:rStyle w:val="None"/>
+          <w:lang w:val="en-US"/>
+        </w:rPr>
+      </w:pPr>
+      <w:r>
+        <w:rPr>
+          <w:rStyle w:val="None"/>
+          <w:rtl w:val="0"/>
+          <w:lang w:val="en-US"/>
+        </w:rPr>
+        <w:t>Senior Technical Program Manager / Backend Engineer with a hybrid background in software engineering and program leadership. Proven track record of driving large-scale platform migrations, leading cross-functional initiatives, and delivering production systems on AWS.</w:t>
       </w:r>
     </w:p>
     <w:p>
@@ -114,11 +226,13 @@
         <w:pStyle w:val="Body A"/>
         <w:spacing w:before="120" w:after="40"/>
         <w:rPr>
+          <w:rStyle w:val="None"/>
           <w:lang w:val="de-DE"/>
         </w:rPr>
       </w:pPr>
       <w:r>
         <w:rPr>
+          <w:rStyle w:val="None"/>
           <w:b w:val="1"/>
           <w:bCs w:val="1"/>
           <w:sz w:val="26"/>
@@ -136,6 +250,7 @@
       </w:pPr>
       <w:r>
         <w:rPr>
+          <w:rStyle w:val="None"/>
           <w:b w:val="1"/>
           <w:bCs w:val="1"/>
           <w:rtl w:val="0"/>
@@ -145,6 +260,7 @@
       </w:r>
       <w:r>
         <w:rPr>
+          <w:rStyle w:val="None"/>
           <w:b w:val="1"/>
           <w:bCs w:val="1"/>
           <w:lang w:val="nl-NL"/>
@@ -153,6 +269,7 @@
       </w:r>
       <w:r>
         <w:rPr>
+          <w:rStyle w:val="None"/>
           <w:rtl w:val="0"/>
           <w:lang w:val="en-US"/>
         </w:rPr>
@@ -160,12 +277,14 @@
       </w:r>
       <w:r>
         <w:rPr>
+          <w:rStyle w:val="None B A"/>
           <w:lang w:val="nl-NL"/>
         </w:rPr>
         <w:br w:type="textWrapping"/>
       </w:r>
       <w:r>
         <w:rPr>
+          <w:rStyle w:val="None"/>
           <w:rtl w:val="0"/>
           <w:lang w:val="en-US"/>
         </w:rPr>
@@ -173,6 +292,7 @@
       </w:r>
       <w:r>
         <w:rPr>
+          <w:rStyle w:val="None B A"/>
           <w:rtl w:val="0"/>
           <w:lang w:val="nl-NL"/>
         </w:rPr>
@@ -180,6 +300,7 @@
       </w:r>
       <w:r>
         <w:rPr>
+          <w:rStyle w:val="None B A"/>
           <w:rtl w:val="0"/>
           <w:lang w:val="nl-NL"/>
         </w:rPr>
@@ -191,11 +312,13 @@
         <w:pStyle w:val="Body A"/>
         <w:spacing w:before="80" w:after="0"/>
         <w:rPr>
-          <w:lang w:val="en-US"/>
-        </w:rPr>
-      </w:pPr>
-      <w:r>
-        <w:rPr>
+          <w:rStyle w:val="None"/>
+          <w:lang w:val="en-US"/>
+        </w:rPr>
+      </w:pPr>
+      <w:r>
+        <w:rPr>
+          <w:rStyle w:val="None"/>
           <w:b w:val="1"/>
           <w:bCs w:val="1"/>
           <w:sz w:val="24"/>
@@ -224,6 +347,7 @@
       </w:pPr>
       <w:r>
         <w:rPr>
+          <w:rStyle w:val="None B"/>
           <w:rtl w:val="0"/>
           <w:lang w:val="en-US"/>
         </w:rPr>
@@ -248,6 +372,7 @@
       </w:pPr>
       <w:r>
         <w:rPr>
+          <w:rStyle w:val="None B"/>
           <w:rtl w:val="0"/>
           <w:lang w:val="en-US"/>
         </w:rPr>
@@ -272,6 +397,7 @@
       </w:pPr>
       <w:r>
         <w:rPr>
+          <w:rStyle w:val="None B"/>
           <w:rtl w:val="0"/>
           <w:lang w:val="en-US"/>
         </w:rPr>
@@ -296,6 +422,7 @@
       </w:pPr>
       <w:r>
         <w:rPr>
+          <w:rStyle w:val="None B"/>
           <w:rtl w:val="0"/>
           <w:lang w:val="en-US"/>
         </w:rPr>
@@ -307,11 +434,13 @@
         <w:pStyle w:val="Body A"/>
         <w:spacing w:before="80" w:after="0"/>
         <w:rPr>
-          <w:lang w:val="en-US"/>
-        </w:rPr>
-      </w:pPr>
-      <w:r>
-        <w:rPr>
+          <w:rStyle w:val="None"/>
+          <w:lang w:val="en-US"/>
+        </w:rPr>
+      </w:pPr>
+      <w:r>
+        <w:rPr>
+          <w:rStyle w:val="None"/>
           <w:b w:val="1"/>
           <w:bCs w:val="1"/>
           <w:sz w:val="24"/>
@@ -320,6 +449,31 @@
           <w:lang w:val="en-US"/>
         </w:rPr>
         <w:t>Platform &amp; Backend Systems</w:t>
+      </w:r>
+    </w:p>
+    <w:p>
+      <w:pPr>
+        <w:pStyle w:val="List Bullet"/>
+        <w:numPr>
+          <w:ilvl w:val="1"/>
+          <w:numId w:val="2"/>
+        </w:numPr>
+        <w:bidi w:val="0"/>
+        <w:spacing w:after="0"/>
+        <w:ind w:right="0"/>
+        <w:jc w:val="left"/>
+        <w:rPr>
+          <w:rtl w:val="0"/>
+          <w:lang w:val="en-US"/>
+        </w:rPr>
+      </w:pPr>
+      <w:r>
+        <w:rPr>
+          <w:rStyle w:val="None B"/>
+          <w:rtl w:val="0"/>
+          <w:lang w:val="en-US"/>
+        </w:rPr>
+        <w:t>Developed a containerized API proxy and token management system on AWS ECS/Fargate, improving authentication reliability and service scalability in a high throughput system</w:t>
       </w:r>
     </w:p>
     <w:p>
@@ -340,10 +494,11 @@
       </w:pPr>
       <w:r>
         <w:rPr>
-          <w:rtl w:val="0"/>
-          <w:lang w:val="en-US"/>
-        </w:rPr>
-        <w:t>Developed a containerized API proxy and token management system on AWS ECS/Fargate, improving authentication reliability and service scalability</w:t>
+          <w:rStyle w:val="None B"/>
+          <w:rtl w:val="0"/>
+          <w:lang w:val="en-US"/>
+        </w:rPr>
+        <w:t>Drove migration from Oracle to MySQL, including schema redesign, data migration strategy, and implementing code changes to eliminate legacy database dependencies</w:t>
       </w:r>
     </w:p>
     <w:p>
@@ -364,10 +519,11 @@
       </w:pPr>
       <w:r>
         <w:rPr>
-          <w:rtl w:val="0"/>
-          <w:lang w:val="en-US"/>
-        </w:rPr>
-        <w:t>Drove migration from Oracle to MySQL, including schema redesign, data migration strategy, and elimination of legacy database dependencies</w:t>
+          <w:rStyle w:val="None B"/>
+          <w:rtl w:val="0"/>
+          <w:lang w:val="en-US"/>
+        </w:rPr>
+        <w:t>Coordinated migration of image caching infrastructure from Akamai to Cloudflare, updating image caching code base, partnering with clients to install updated domain certs</w:t>
       </w:r>
     </w:p>
     <w:p>
@@ -388,10 +544,11 @@
       </w:pPr>
       <w:r>
         <w:rPr>
-          <w:rtl w:val="0"/>
-          <w:lang w:val="en-US"/>
-        </w:rPr>
-        <w:t>Coordinated migration of image caching infrastructure from Akamai to Cloudflare, aligning application changes and external dependencies</w:t>
+          <w:rStyle w:val="None B"/>
+          <w:rtl w:val="0"/>
+          <w:lang w:val="en-US"/>
+        </w:rPr>
+        <w:t>Developed backend services for authentication, campaign data, service health, and DynamoDB integrations in high-throughput systems</w:t>
       </w:r>
     </w:p>
     <w:p>
@@ -412,10 +569,33 @@
       </w:pPr>
       <w:r>
         <w:rPr>
-          <w:rtl w:val="0"/>
-          <w:lang w:val="en-US"/>
-        </w:rPr>
-        <w:t>Developed backend services for authentication, campaign data, service health, and DynamoDB integrations in high-throughput systems</w:t>
+          <w:rStyle w:val="None B"/>
+          <w:rtl w:val="0"/>
+          <w:lang w:val="en-US"/>
+        </w:rPr>
+        <w:t>Defined API contracts using Swagger/OpenAPI to support cross-team and client integrations</w:t>
+      </w:r>
+    </w:p>
+    <w:p>
+      <w:pPr>
+        <w:pStyle w:val="Body A"/>
+        <w:spacing w:before="80" w:after="0"/>
+        <w:rPr>
+          <w:rStyle w:val="None"/>
+          <w:lang w:val="en-US"/>
+        </w:rPr>
+      </w:pPr>
+      <w:r>
+        <w:rPr>
+          <w:rStyle w:val="None"/>
+          <w:b w:val="1"/>
+          <w:bCs w:val="1"/>
+          <w:sz w:val="24"/>
+          <w:szCs w:val="24"/>
+          <w:rtl w:val="0"/>
+          <w:lang w:val="en-US"/>
+        </w:rPr>
+        <w:t>Machine Learning / Data Platform</w:t>
       </w:r>
     </w:p>
     <w:p>
@@ -436,30 +616,27 @@
       </w:pPr>
       <w:r>
         <w:rPr>
-          <w:rtl w:val="0"/>
-          <w:lang w:val="en-US"/>
-        </w:rPr>
-        <w:t>Defined API contracts using Swagger/OpenAPI to support cross-team and client integrations</w:t>
-      </w:r>
-    </w:p>
-    <w:p>
-      <w:pPr>
-        <w:pStyle w:val="Body A"/>
-        <w:spacing w:before="80" w:after="0"/>
-        <w:rPr>
-          <w:lang w:val="en-US"/>
-        </w:rPr>
-      </w:pPr>
-      <w:r>
-        <w:rPr>
-          <w:b w:val="1"/>
-          <w:bCs w:val="1"/>
-          <w:sz w:val="24"/>
-          <w:szCs w:val="24"/>
-          <w:rtl w:val="0"/>
-          <w:lang w:val="en-US"/>
-        </w:rPr>
-        <w:t>Machine Learning / Data Platform</w:t>
+          <w:rStyle w:val="None B"/>
+          <w:rtl w:val="0"/>
+          <w:lang w:val="en-US"/>
+        </w:rPr>
+        <w:t>Led onboarding of 100+ clients to ML platform over two quarters, designing ingestion pipelines using ClickHouse S3 integration and EventBridge to process multi-terabyte datasets (10</w:t>
+      </w:r>
+      <w:r>
+        <w:rPr>
+          <w:rStyle w:val="None B"/>
+          <w:rtl w:val="0"/>
+          <w:lang w:val="en-US"/>
+        </w:rPr>
+        <w:t>–</w:t>
+      </w:r>
+      <w:r>
+        <w:rPr>
+          <w:rStyle w:val="None B"/>
+          <w:rtl w:val="0"/>
+          <w:lang w:val="en-US"/>
+        </w:rPr>
+        <w:t>50GB per client)</w:t>
       </w:r>
     </w:p>
     <w:p>
@@ -480,24 +657,11 @@
       </w:pPr>
       <w:r>
         <w:rPr>
-          <w:rtl w:val="0"/>
-          <w:lang w:val="en-US"/>
-        </w:rPr>
-        <w:t>Led onboarding of 100+ clients to ML platform over two quarters, designing ingestion pipelines using ClickHouse S3 integration and EventBridge to process multi-terabyte datasets (10</w:t>
-      </w:r>
-      <w:r>
-        <w:rPr>
-          <w:rtl w:val="0"/>
-          <w:lang w:val="en-US"/>
-        </w:rPr>
-        <w:t>–</w:t>
-      </w:r>
-      <w:r>
-        <w:rPr>
-          <w:rtl w:val="0"/>
-          <w:lang w:val="en-US"/>
-        </w:rPr>
-        <w:t>50GB per client)</w:t>
+          <w:rStyle w:val="None B"/>
+          <w:rtl w:val="0"/>
+          <w:lang w:val="en-US"/>
+        </w:rPr>
+        <w:t>Partnered with Analytics to deliver nightly pipelines using Athena and S3, defining ClickHouse queries, implementing client-driven export controls via flag files, enabling cross-team S3 access via AWS SAM, and building monitoring to ensure reliable ingestion</w:t>
       </w:r>
     </w:p>
     <w:p>
@@ -518,10 +682,33 @@
       </w:pPr>
       <w:r>
         <w:rPr>
-          <w:rtl w:val="0"/>
-          <w:lang w:val="en-US"/>
-        </w:rPr>
-        <w:t>Partnered with Analytics to deliver nightly pipelines using Athena and S3, defining ClickHouse queries, implementing client-driven export controls via flag files, enabling cross-team S3 access via AWS SAM, and building monitoring to ensure reliable ingestion</w:t>
+          <w:rStyle w:val="None B"/>
+          <w:rtl w:val="0"/>
+          <w:lang w:val="en-US"/>
+        </w:rPr>
+        <w:t>Contributed to delivery of Propensity-to-Purchase and Discount Optimization models via a serverless ML platform (Lambda, SQS, EventBridge, SageMaker), coding a data assessment layer and partnering across teams to source higher-quality purchase data from distributed systems (ClickHouse, Hive)</w:t>
+      </w:r>
+    </w:p>
+    <w:p>
+      <w:pPr>
+        <w:pStyle w:val="Body A"/>
+        <w:spacing w:before="80" w:after="0"/>
+        <w:rPr>
+          <w:rStyle w:val="None"/>
+          <w:lang w:val="en-US"/>
+        </w:rPr>
+      </w:pPr>
+      <w:r>
+        <w:rPr>
+          <w:rStyle w:val="None"/>
+          <w:b w:val="1"/>
+          <w:bCs w:val="1"/>
+          <w:sz w:val="24"/>
+          <w:szCs w:val="24"/>
+          <w:rtl w:val="0"/>
+          <w:lang w:val="en-US"/>
+        </w:rPr>
+        <w:t>Observability &amp; Reliability</w:t>
       </w:r>
     </w:p>
     <w:p>
@@ -542,30 +729,11 @@
       </w:pPr>
       <w:r>
         <w:rPr>
-          <w:rtl w:val="0"/>
-          <w:lang w:val="en-US"/>
-        </w:rPr>
-        <w:t>Contributed to delivery of Propensity-to-Purchase and Discount Optimization models via a serverless ML platform (Lambda, SQS, EventBridge, SageMaker), introducing a data assessment layer and partnering across teams to source higher-quality purchase data from distributed systems (ClickHouse, Hive)</w:t>
-      </w:r>
-    </w:p>
-    <w:p>
-      <w:pPr>
-        <w:pStyle w:val="Body A"/>
-        <w:spacing w:before="80" w:after="0"/>
-        <w:rPr>
-          <w:lang w:val="en-US"/>
-        </w:rPr>
-      </w:pPr>
-      <w:r>
-        <w:rPr>
-          <w:b w:val="1"/>
-          <w:bCs w:val="1"/>
-          <w:sz w:val="24"/>
-          <w:szCs w:val="24"/>
-          <w:rtl w:val="0"/>
-          <w:lang w:val="en-US"/>
-        </w:rPr>
-        <w:t>Observability &amp; Reliability</w:t>
+          <w:rStyle w:val="None B"/>
+          <w:rtl w:val="0"/>
+          <w:lang w:val="en-US"/>
+        </w:rPr>
+        <w:t>Led development of a custom observability framework (structured logging, distributed tracing, Prometheus, Grafana) for high-throughput, time-sensitive systems processing thousands of event based messages per minute</w:t>
       </w:r>
     </w:p>
     <w:p>
@@ -586,10 +754,81 @@
       </w:pPr>
       <w:r>
         <w:rPr>
-          <w:rtl w:val="0"/>
-          <w:lang w:val="en-US"/>
-        </w:rPr>
-        <w:t>Led development of a custom observability framework (structured logging, distributed tracing, Prometheus, Grafana) for high-throughput, time-sensitive systems processing thousands of messages per minute</w:t>
+          <w:rStyle w:val="None B"/>
+          <w:rtl w:val="0"/>
+          <w:lang w:val="en-US"/>
+        </w:rPr>
+        <w:t>Improved system reliability and visibility across clients by enabling real-time monitoring, alerting, and faster issue detection and resolution</w:t>
+      </w:r>
+    </w:p>
+    <w:p>
+      <w:pPr>
+        <w:pStyle w:val="List Bullet"/>
+        <w:spacing w:after="0"/>
+      </w:pPr>
+    </w:p>
+    <w:p>
+      <w:pPr>
+        <w:pStyle w:val="Body A"/>
+        <w:spacing w:after="40"/>
+      </w:pPr>
+      <w:r>
+        <w:rPr>
+          <w:rStyle w:val="None"/>
+          <w:b w:val="1"/>
+          <w:bCs w:val="1"/>
+          <w:rtl w:val="0"/>
+          <w:lang w:val="nl-NL"/>
+        </w:rPr>
+        <w:t>Cheetah Digital</w:t>
+      </w:r>
+      <w:r>
+        <w:rPr>
+          <w:rStyle w:val="None"/>
+          <w:b w:val="1"/>
+          <w:bCs w:val="1"/>
+          <w:lang w:val="nl-NL"/>
+        </w:rPr>
+        <w:br w:type="textWrapping"/>
+      </w:r>
+      <w:r>
+        <w:rPr>
+          <w:rStyle w:val="None"/>
+          <w:rtl w:val="0"/>
+          <w:lang w:val="en-US"/>
+        </w:rPr>
+        <w:t>Technical Program Manager / Software Developer</w:t>
+      </w:r>
+      <w:r>
+        <w:rPr>
+          <w:rStyle w:val="None B A"/>
+          <w:lang w:val="nl-NL"/>
+        </w:rPr>
+        <w:br w:type="textWrapping"/>
+      </w:r>
+      <w:r>
+        <w:rPr>
+          <w:rStyle w:val="None B A"/>
+          <w:rtl w:val="0"/>
+          <w:lang w:val="nl-NL"/>
+        </w:rPr>
+        <w:t xml:space="preserve">2015 </w:t>
+      </w:r>
+      <w:r>
+        <w:rPr>
+          <w:rStyle w:val="None B A"/>
+          <w:rtl w:val="0"/>
+          <w:lang w:val="nl-NL"/>
+        </w:rPr>
+        <w:t xml:space="preserve">– </w:t>
+      </w:r>
+      <w:r>
+        <w:rPr>
+          <w:rStyle w:val="None"/>
+          <w:rtl w:val="0"/>
+          <w:lang w:val="en-US"/>
+        </w:rPr>
+        <w:t>2021</w:t>
       </w:r>
     </w:p>
     <w:p>
@@ -610,73 +849,11 @@
       </w:pPr>
       <w:r>
         <w:rPr>
-          <w:rtl w:val="0"/>
-          <w:lang w:val="en-US"/>
-        </w:rPr>
-        <w:t>Improved system reliability and visibility across clients by enabling real-time monitoring, alerting, and faster issue detection and resolution</w:t>
-      </w:r>
-    </w:p>
-    <w:p>
-      <w:pPr>
-        <w:pStyle w:val="List Bullet"/>
-        <w:spacing w:after="0"/>
-      </w:pPr>
-    </w:p>
-    <w:p>
-      <w:pPr>
-        <w:pStyle w:val="Body A"/>
-        <w:spacing w:after="40"/>
-      </w:pPr>
-      <w:r>
-        <w:rPr>
-          <w:b w:val="1"/>
-          <w:bCs w:val="1"/>
-          <w:rtl w:val="0"/>
-          <w:lang w:val="nl-NL"/>
-        </w:rPr>
-        <w:t>Cheetah Digital</w:t>
-      </w:r>
-      <w:r>
-        <w:rPr>
-          <w:b w:val="1"/>
-          <w:bCs w:val="1"/>
-          <w:lang w:val="nl-NL"/>
-        </w:rPr>
-        <w:br w:type="textWrapping"/>
-      </w:r>
-      <w:r>
-        <w:rPr>
-          <w:rtl w:val="0"/>
-          <w:lang w:val="en-US"/>
-        </w:rPr>
-        <w:t>Technical Program Manager / Software Developer</w:t>
-      </w:r>
-      <w:r>
-        <w:rPr>
-          <w:lang w:val="nl-NL"/>
-        </w:rPr>
-        <w:br w:type="textWrapping"/>
-      </w:r>
-      <w:r>
-        <w:rPr>
-          <w:rtl w:val="0"/>
-          <w:lang w:val="nl-NL"/>
-        </w:rPr>
-        <w:t xml:space="preserve">2015 </w:t>
-      </w:r>
-      <w:r>
-        <w:rPr>
-          <w:rtl w:val="0"/>
-          <w:lang w:val="nl-NL"/>
-        </w:rPr>
-        <w:t xml:space="preserve">– </w:t>
-      </w:r>
-      <w:r>
-        <w:rPr>
-          <w:rtl w:val="0"/>
-          <w:lang w:val="en-US"/>
-        </w:rPr>
-        <w:t>2021</w:t>
+          <w:rStyle w:val="None B"/>
+          <w:rtl w:val="0"/>
+          <w:lang w:val="en-US"/>
+        </w:rPr>
+        <w:t>Led Agile delivery processes as Scrum Master across multiple engineering teams, improving planning accuracy and execution consistency</w:t>
       </w:r>
     </w:p>
     <w:p>
@@ -697,10 +874,11 @@
       </w:pPr>
       <w:r>
         <w:rPr>
-          <w:rtl w:val="0"/>
-          <w:lang w:val="en-US"/>
-        </w:rPr>
-        <w:t>Led Agile delivery processes as Scrum Master across multiple engineering teams, improving planning accuracy and execution consistency</w:t>
+          <w:rStyle w:val="None B"/>
+          <w:rtl w:val="0"/>
+          <w:lang w:val="en-US"/>
+        </w:rPr>
+        <w:t>Coordinated cross-functional efforts between engineering, SRE, and release teams to deliver platform enhancements</w:t>
       </w:r>
     </w:p>
     <w:p>
@@ -721,10 +899,11 @@
       </w:pPr>
       <w:r>
         <w:rPr>
-          <w:rtl w:val="0"/>
-          <w:lang w:val="en-US"/>
-        </w:rPr>
-        <w:t>Coordinated cross-functional efforts between engineering, SRE, and release teams to deliver platform enhancements</w:t>
+          <w:rStyle w:val="None B"/>
+          <w:rtl w:val="0"/>
+          <w:lang w:val="en-US"/>
+        </w:rPr>
+        <w:t>Contributed to backend services and data processing systems supporting high-volume client workloads</w:t>
       </w:r>
     </w:p>
     <w:p>
@@ -745,10 +924,81 @@
       </w:pPr>
       <w:r>
         <w:rPr>
-          <w:rtl w:val="0"/>
-          <w:lang w:val="en-US"/>
-        </w:rPr>
-        <w:t>Contributed to backend services and data processing systems supporting high-volume client workloads</w:t>
+          <w:rStyle w:val="None B"/>
+          <w:rtl w:val="0"/>
+          <w:lang w:val="en-US"/>
+        </w:rPr>
+        <w:t>Partnered directly with clients to support integrations, troubleshoot issues, and ensure successful delivery</w:t>
+      </w:r>
+    </w:p>
+    <w:p>
+      <w:pPr>
+        <w:pStyle w:val="List Bullet"/>
+        <w:spacing w:after="0"/>
+      </w:pPr>
+    </w:p>
+    <w:p>
+      <w:pPr>
+        <w:pStyle w:val="Body A"/>
+        <w:spacing w:after="40"/>
+      </w:pPr>
+      <w:r>
+        <w:rPr>
+          <w:rStyle w:val="None"/>
+          <w:b w:val="1"/>
+          <w:bCs w:val="1"/>
+          <w:rtl w:val="0"/>
+          <w:lang w:val="de-DE"/>
+        </w:rPr>
+        <w:t>CheetahMail / Experian</w:t>
+      </w:r>
+      <w:r>
+        <w:rPr>
+          <w:rStyle w:val="None"/>
+          <w:b w:val="1"/>
+          <w:bCs w:val="1"/>
+          <w:lang w:val="nl-NL"/>
+        </w:rPr>
+        <w:br w:type="textWrapping"/>
+      </w:r>
+      <w:r>
+        <w:rPr>
+          <w:rStyle w:val="None"/>
+          <w:rtl w:val="0"/>
+          <w:lang w:val="en-US"/>
+        </w:rPr>
+        <w:t>Software Developer</w:t>
+      </w:r>
+      <w:r>
+        <w:rPr>
+          <w:rStyle w:val="None B A"/>
+          <w:lang w:val="nl-NL"/>
+        </w:rPr>
+        <w:br w:type="textWrapping"/>
+      </w:r>
+      <w:r>
+        <w:rPr>
+          <w:rStyle w:val="None B A"/>
+          <w:rtl w:val="0"/>
+          <w:lang w:val="nl-NL"/>
+        </w:rPr>
+        <w:t xml:space="preserve">2008 </w:t>
+      </w:r>
+      <w:r>
+        <w:rPr>
+          <w:rStyle w:val="None B A"/>
+          <w:rtl w:val="0"/>
+          <w:lang w:val="nl-NL"/>
+        </w:rPr>
+        <w:t xml:space="preserve">– </w:t>
+      </w:r>
+      <w:r>
+        <w:rPr>
+          <w:rStyle w:val="None B A"/>
+          <w:rtl w:val="0"/>
+          <w:lang w:val="nl-NL"/>
+        </w:rPr>
+        <w:t>2015</w:t>
       </w:r>
     </w:p>
     <w:p>
@@ -764,78 +1014,16 @@
         <w:jc w:val="left"/>
         <w:rPr>
           <w:rtl w:val="0"/>
-          <w:lang w:val="en-US"/>
-        </w:rPr>
-      </w:pPr>
-      <w:r>
-        <w:rPr>
-          <w:rtl w:val="0"/>
-          <w:lang w:val="en-US"/>
-        </w:rPr>
-        <w:t>Partnered directly with clients to support integrations, troubleshoot issues, and ensure successful delivery</w:t>
-      </w:r>
-    </w:p>
-    <w:p>
-      <w:pPr>
-        <w:pStyle w:val="List Bullet"/>
-        <w:spacing w:after="0"/>
-      </w:pPr>
-    </w:p>
-    <w:p>
-      <w:pPr>
-        <w:pStyle w:val="Body A"/>
-        <w:spacing w:after="40"/>
-      </w:pPr>
-      <w:r>
-        <w:rPr>
-          <w:b w:val="1"/>
-          <w:bCs w:val="1"/>
-          <w:rtl w:val="0"/>
-          <w:lang w:val="de-DE"/>
-        </w:rPr>
-        <w:t>CheetahMail / Experian</w:t>
-      </w:r>
-      <w:r>
-        <w:rPr>
-          <w:b w:val="1"/>
-          <w:bCs w:val="1"/>
           <w:lang w:val="nl-NL"/>
         </w:rPr>
-        <w:br w:type="textWrapping"/>
-      </w:r>
-      <w:r>
-        <w:rPr>
-          <w:rtl w:val="0"/>
-          <w:lang w:val="en-US"/>
-        </w:rPr>
-        <w:t>Software Developer</w:t>
-      </w:r>
-      <w:r>
-        <w:rPr>
+      </w:pPr>
+      <w:r>
+        <w:rPr>
+          <w:rStyle w:val="None B A"/>
+          <w:rtl w:val="0"/>
           <w:lang w:val="nl-NL"/>
         </w:rPr>
-        <w:br w:type="textWrapping"/>
-      </w:r>
-      <w:r>
-        <w:rPr>
-          <w:rtl w:val="0"/>
-          <w:lang w:val="nl-NL"/>
-        </w:rPr>
-        <w:t xml:space="preserve">2008 </w:t>
-      </w:r>
-      <w:r>
-        <w:rPr>
-          <w:rtl w:val="0"/>
-          <w:lang w:val="nl-NL"/>
-        </w:rPr>
-        <w:t xml:space="preserve">– </w:t>
-      </w:r>
-      <w:r>
-        <w:rPr>
-          <w:rtl w:val="0"/>
-          <w:lang w:val="nl-NL"/>
-        </w:rPr>
-        <w:t>2015</w:t>
+        <w:t>Scrum master and developer for Cheetahmail development team</w:t>
       </w:r>
     </w:p>
     <w:p>
@@ -851,15 +1039,16 @@
         <w:jc w:val="left"/>
         <w:rPr>
           <w:rtl w:val="0"/>
-          <w:lang w:val="nl-NL"/>
-        </w:rPr>
-      </w:pPr>
-      <w:r>
-        <w:rPr>
-          <w:rtl w:val="0"/>
-          <w:lang w:val="nl-NL"/>
-        </w:rPr>
-        <w:t>Scrum master and developer for Cheetahmail development team</w:t>
+          <w:lang w:val="en-US"/>
+        </w:rPr>
+      </w:pPr>
+      <w:r>
+        <w:rPr>
+          <w:rStyle w:val="None B"/>
+          <w:rtl w:val="0"/>
+          <w:lang w:val="en-US"/>
+        </w:rPr>
+        <w:t>Improved reporting performance by implementing bulk data loading solutions using SQL*Loader for high-volume datasets</w:t>
       </w:r>
     </w:p>
     <w:p>
@@ -880,10 +1069,11 @@
       </w:pPr>
       <w:r>
         <w:rPr>
-          <w:rtl w:val="0"/>
-          <w:lang w:val="en-US"/>
-        </w:rPr>
-        <w:t>Improved reporting performance by implementing bulk data loading solutions using SQL*Loader for high-volume datasets</w:t>
+          <w:rStyle w:val="None B"/>
+          <w:rtl w:val="0"/>
+          <w:lang w:val="en-US"/>
+        </w:rPr>
+        <w:t>Built ETL pipelines for client data ingestion (text/XML) into BerkeleyDB/CDB systems and supported API integrations</w:t>
       </w:r>
     </w:p>
     <w:p>
@@ -893,30 +1083,6 @@
           <w:ilvl w:val="0"/>
           <w:numId w:val="2"/>
         </w:numPr>
-        <w:bidi w:val="0"/>
-        <w:spacing w:after="0"/>
-        <w:ind w:right="0"/>
-        <w:jc w:val="left"/>
-        <w:rPr>
-          <w:rtl w:val="0"/>
-          <w:lang w:val="en-US"/>
-        </w:rPr>
-      </w:pPr>
-      <w:r>
-        <w:rPr>
-          <w:rtl w:val="0"/>
-          <w:lang w:val="en-US"/>
-        </w:rPr>
-        <w:t>Built ETL pipelines for client data ingestion (text/XML) into BerkeleyDB/CDB systems and supported API integrations</w:t>
-      </w:r>
-    </w:p>
-    <w:p>
-      <w:pPr>
-        <w:pStyle w:val="List Bullet"/>
-        <w:numPr>
-          <w:ilvl w:val="0"/>
-          <w:numId w:val="2"/>
-        </w:numPr>
         <w:spacing w:after="0"/>
       </w:pPr>
     </w:p>
@@ -925,11 +1091,13 @@
         <w:pStyle w:val="Body A"/>
         <w:spacing w:before="120" w:after="40"/>
         <w:rPr>
-          <w:lang w:val="en-US"/>
-        </w:rPr>
-      </w:pPr>
-      <w:r>
-        <w:rPr>
+          <w:rStyle w:val="None"/>
+          <w:lang w:val="en-US"/>
+        </w:rPr>
+      </w:pPr>
+      <w:r>
+        <w:rPr>
+          <w:rStyle w:val="None"/>
           <w:b w:val="1"/>
           <w:bCs w:val="1"/>
           <w:sz w:val="26"/>
@@ -945,11 +1113,13 @@
         <w:pStyle w:val="Body A"/>
         <w:spacing w:after="0"/>
         <w:rPr>
-          <w:lang w:val="en-US"/>
-        </w:rPr>
-      </w:pPr>
-      <w:r>
-        <w:rPr>
+          <w:rStyle w:val="None"/>
+          <w:lang w:val="en-US"/>
+        </w:rPr>
+      </w:pPr>
+      <w:r>
+        <w:rPr>
+          <w:rStyle w:val="None"/>
           <w:rtl w:val="0"/>
           <w:lang w:val="en-US"/>
         </w:rPr>
@@ -961,11 +1131,13 @@
         <w:pStyle w:val="Body A"/>
         <w:spacing w:after="0"/>
         <w:rPr>
-          <w:lang w:val="en-US"/>
-        </w:rPr>
-      </w:pPr>
-      <w:r>
-        <w:rPr>
+          <w:rStyle w:val="None"/>
+          <w:lang w:val="en-US"/>
+        </w:rPr>
+      </w:pPr>
+      <w:r>
+        <w:rPr>
+          <w:rStyle w:val="None"/>
           <w:rtl w:val="0"/>
           <w:lang w:val="en-US"/>
         </w:rPr>
@@ -977,11 +1149,13 @@
         <w:pStyle w:val="Body A"/>
         <w:spacing w:after="0"/>
         <w:rPr>
+          <w:rStyle w:val="None"/>
           <w:lang w:val="es-ES_tradnl"/>
         </w:rPr>
       </w:pPr>
       <w:r>
         <w:rPr>
+          <w:rStyle w:val="None"/>
           <w:rtl w:val="0"/>
           <w:lang w:val="es-ES_tradnl"/>
         </w:rPr>
@@ -993,11 +1167,13 @@
         <w:pStyle w:val="Body A"/>
         <w:spacing w:after="0"/>
         <w:rPr>
-          <w:lang w:val="en-US"/>
-        </w:rPr>
-      </w:pPr>
-      <w:r>
-        <w:rPr>
+          <w:rStyle w:val="None"/>
+          <w:lang w:val="en-US"/>
+        </w:rPr>
+      </w:pPr>
+      <w:r>
+        <w:rPr>
+          <w:rStyle w:val="None"/>
           <w:rtl w:val="0"/>
           <w:lang w:val="en-US"/>
         </w:rPr>
@@ -1009,11 +1185,13 @@
         <w:pStyle w:val="Body A"/>
         <w:spacing w:after="0"/>
         <w:rPr>
-          <w:lang w:val="en-US"/>
-        </w:rPr>
-      </w:pPr>
-      <w:r>
-        <w:rPr>
+          <w:rStyle w:val="None"/>
+          <w:lang w:val="en-US"/>
+        </w:rPr>
+      </w:pPr>
+      <w:r>
+        <w:rPr>
+          <w:rStyle w:val="None"/>
           <w:rtl w:val="0"/>
           <w:lang w:val="en-US"/>
         </w:rPr>
@@ -1031,28 +1209,31 @@
         <w:pStyle w:val="Body A"/>
         <w:spacing w:after="0"/>
         <w:rPr>
+          <w:rStyle w:val="None B"/>
+        </w:rPr>
+      </w:pPr>
+      <w:r>
+        <w:rPr>
+          <w:rStyle w:val="None"/>
+          <w:rtl w:val="0"/>
+          <w:lang w:val="en-US"/>
+        </w:rPr>
+        <w:t xml:space="preserve">Education: Bachelor of Arts, International Relations </w:t>
+      </w:r>
+      <w:r>
+        <w:rPr>
+          <w:rStyle w:val="None"/>
+          <w:rtl w:val="0"/>
+          <w:lang w:val="en-US"/>
+        </w:rPr>
+        <w:t xml:space="preserve">— </w:t>
+      </w:r>
+      <w:r>
+        <w:rPr>
+          <w:rStyle w:val="None"/>
+          <w:rtl w:val="0"/>
           <w:lang w:val="de-DE"/>
         </w:rPr>
-      </w:pPr>
-      <w:r>
-        <w:rPr>
-          <w:rtl w:val="0"/>
-          <w:lang w:val="en-US"/>
-        </w:rPr>
-        <w:t xml:space="preserve">Education: Bachelor of Arts, International Relations </w:t>
-      </w:r>
-      <w:r>
-        <w:rPr>
-          <w:rtl w:val="0"/>
-          <w:lang w:val="en-US"/>
-        </w:rPr>
-        <w:t xml:space="preserve">— </w:t>
-      </w:r>
-      <w:r>
-        <w:rPr>
-          <w:rtl w:val="0"/>
-          <w:lang w:val="de-DE"/>
-        </w:rPr>
         <w:t>Tulane University</w:t>
       </w:r>
     </w:p>
@@ -1063,8 +1244,7 @@
       </w:pPr>
       <w:r>
         <w:rPr>
-          <w:sz w:val="22"/>
-          <w:szCs w:val="22"/>
+          <w:rStyle w:val="None"/>
           <w:rtl w:val="0"/>
           <w:lang w:val="en-US"/>
         </w:rPr>
@@ -1626,19 +1806,51 @@
       </w14:textFill>
     </w:rPr>
   </w:style>
+  <w:style w:type="character" w:styleId="None B A">
+    <w:name w:val="None B A"/>
+    <w:rPr>
+      <w:lang w:val="nl-NL"/>
+    </w:rPr>
+  </w:style>
+  <w:style w:type="character" w:styleId="None">
+    <w:name w:val="None"/>
+  </w:style>
   <w:style w:type="character" w:styleId="Hyperlink.0">
     <w:name w:val="Hyperlink.0"/>
-    <w:basedOn w:val="Hyperlink"/>
+    <w:basedOn w:val="None"/>
     <w:next w:val="Hyperlink.0"/>
     <w:rPr>
       <w:outline w:val="0"/>
       <w:color w:val="0000ff"/>
       <w:u w:val="single" w:color="0000ff"/>
+      <w:lang w:val="en-US"/>
       <w14:textFill>
         <w14:solidFill>
           <w14:srgbClr w14:val="0000FF"/>
         </w14:solidFill>
       </w14:textFill>
+    </w:rPr>
+  </w:style>
+  <w:style w:type="character" w:styleId="Hyperlink.1">
+    <w:name w:val="Hyperlink.1"/>
+    <w:basedOn w:val="None"/>
+    <w:next w:val="Hyperlink.1"/>
+    <w:rPr>
+      <w:outline w:val="0"/>
+      <w:color w:val="0000ff"/>
+      <w:u w:val="single" w:color="0000ff"/>
+      <w:lang w:val="nl-NL"/>
+      <w14:textFill>
+        <w14:solidFill>
+          <w14:srgbClr w14:val="0000FF"/>
+        </w14:solidFill>
+      </w14:textFill>
+    </w:rPr>
+  </w:style>
+  <w:style w:type="character" w:styleId="None B">
+    <w:name w:val="None B"/>
+    <w:rPr>
+      <w:lang w:val="nl-NL"/>
     </w:rPr>
   </w:style>
   <w:style w:type="paragraph" w:styleId="List Bullet">

</xml_diff>

<commit_message>
change ordering of backend engineering and ML
</commit_message>
<xml_diff>
--- a/public/docs/reidcollins.docx
+++ b/public/docs/reidcollins.docx
@@ -25,7 +25,6 @@
       </w:pPr>
       <w:r>
         <w:rPr>
-          <w:rStyle w:val="None B A"/>
           <w:rtl w:val="0"/>
           <w:lang w:val="nl-NL"/>
         </w:rPr>
@@ -90,7 +89,7 @@
             </w14:solidFill>
           </w14:textFill>
         </w:rPr>
-        <w:t>hihellloreid.com</w:t>
+        <w:t>hihelloreid.com</w:t>
       </w:r>
       <w:r>
         <w:rPr/>
@@ -98,6 +97,7 @@
       </w:r>
       <w:r>
         <w:rPr>
+          <w:rStyle w:val="None"/>
           <w:rtl w:val="0"/>
           <w:lang w:val="en-US"/>
         </w:rPr>
@@ -175,7 +175,7 @@
       </w:pPr>
       <w:r>
         <w:rPr>
-          <w:rStyle w:val="None B"/>
+          <w:rStyle w:val="None A"/>
           <w:rtl w:val="0"/>
         </w:rPr>
         <w:t>Open to Senior Technical Program Manager, Platform, and Infrastructure roles</w:t>
@@ -277,7 +277,7 @@
       </w:r>
       <w:r>
         <w:rPr>
-          <w:rStyle w:val="None B A"/>
+          <w:rStyle w:val="None"/>
           <w:lang w:val="nl-NL"/>
         </w:rPr>
         <w:br w:type="textWrapping"/>
@@ -292,7 +292,7 @@
       </w:r>
       <w:r>
         <w:rPr>
-          <w:rStyle w:val="None B A"/>
+          <w:rStyle w:val="None"/>
           <w:rtl w:val="0"/>
           <w:lang w:val="nl-NL"/>
         </w:rPr>
@@ -300,7 +300,7 @@
       </w:r>
       <w:r>
         <w:rPr>
-          <w:rStyle w:val="None B A"/>
+          <w:rStyle w:val="None"/>
           <w:rtl w:val="0"/>
           <w:lang w:val="nl-NL"/>
         </w:rPr>
@@ -347,7 +347,7 @@
       </w:pPr>
       <w:r>
         <w:rPr>
-          <w:rStyle w:val="None B"/>
+          <w:rStyle w:val="None A"/>
           <w:rtl w:val="0"/>
           <w:lang w:val="en-US"/>
         </w:rPr>
@@ -372,7 +372,7 @@
       </w:pPr>
       <w:r>
         <w:rPr>
-          <w:rStyle w:val="None B"/>
+          <w:rStyle w:val="None A"/>
           <w:rtl w:val="0"/>
           <w:lang w:val="en-US"/>
         </w:rPr>
@@ -397,7 +397,7 @@
       </w:pPr>
       <w:r>
         <w:rPr>
-          <w:rStyle w:val="None B"/>
+          <w:rStyle w:val="None A"/>
           <w:rtl w:val="0"/>
           <w:lang w:val="en-US"/>
         </w:rPr>
@@ -422,11 +422,124 @@
       </w:pPr>
       <w:r>
         <w:rPr>
-          <w:rStyle w:val="None B"/>
+          <w:rStyle w:val="None A"/>
           <w:rtl w:val="0"/>
           <w:lang w:val="en-US"/>
         </w:rPr>
         <w:t>Established and enforced team execution processes (sprint planning, backlog grooming, retrospectives), improving delivery consistency and visibility in a Kanban environment</w:t>
+      </w:r>
+    </w:p>
+    <w:p>
+      <w:pPr>
+        <w:pStyle w:val="Body A"/>
+        <w:spacing w:before="80" w:after="0"/>
+        <w:rPr>
+          <w:rStyle w:val="None"/>
+          <w:lang w:val="en-US"/>
+        </w:rPr>
+      </w:pPr>
+      <w:r>
+        <w:rPr>
+          <w:rStyle w:val="None"/>
+          <w:b w:val="1"/>
+          <w:bCs w:val="1"/>
+          <w:sz w:val="24"/>
+          <w:szCs w:val="24"/>
+          <w:rtl w:val="0"/>
+          <w:lang w:val="en-US"/>
+        </w:rPr>
+        <w:t>Machine Learning / Data Platform</w:t>
+      </w:r>
+    </w:p>
+    <w:p>
+      <w:pPr>
+        <w:pStyle w:val="List Bullet"/>
+        <w:numPr>
+          <w:ilvl w:val="0"/>
+          <w:numId w:val="2"/>
+        </w:numPr>
+        <w:bidi w:val="0"/>
+        <w:spacing w:after="0"/>
+        <w:ind w:right="0"/>
+        <w:jc w:val="left"/>
+        <w:rPr>
+          <w:rtl w:val="0"/>
+          <w:lang w:val="en-US"/>
+        </w:rPr>
+      </w:pPr>
+      <w:r>
+        <w:rPr>
+          <w:rStyle w:val="None A"/>
+          <w:rtl w:val="0"/>
+          <w:lang w:val="en-US"/>
+        </w:rPr>
+        <w:t>Led onboarding of 100+ clients to ML platform over two quarters, designing ingestion pipelines using ClickHouse S3 integration and EventBridge to process multi-terabyte datasets (10</w:t>
+      </w:r>
+      <w:r>
+        <w:rPr>
+          <w:rStyle w:val="None A"/>
+          <w:rtl w:val="0"/>
+          <w:lang w:val="en-US"/>
+        </w:rPr>
+        <w:t>–</w:t>
+      </w:r>
+      <w:r>
+        <w:rPr>
+          <w:rStyle w:val="None A"/>
+          <w:rtl w:val="0"/>
+          <w:lang w:val="en-US"/>
+        </w:rPr>
+        <w:t>50GB per client)</w:t>
+      </w:r>
+    </w:p>
+    <w:p>
+      <w:pPr>
+        <w:pStyle w:val="List Bullet"/>
+        <w:numPr>
+          <w:ilvl w:val="0"/>
+          <w:numId w:val="2"/>
+        </w:numPr>
+        <w:bidi w:val="0"/>
+        <w:spacing w:after="0"/>
+        <w:ind w:right="0"/>
+        <w:jc w:val="left"/>
+        <w:rPr>
+          <w:rtl w:val="0"/>
+          <w:lang w:val="en-US"/>
+        </w:rPr>
+      </w:pPr>
+      <w:r>
+        <w:rPr>
+          <w:rStyle w:val="None A"/>
+          <w:rtl w:val="0"/>
+          <w:lang w:val="en-US"/>
+        </w:rPr>
+        <w:t>Partnered with Analytics to deliver nightly pipelines using Athena and S3, defining ClickHouse queries, implementing client-driven export controls via flag files, enabling cross-team S3 access via AWS SAM, and building monitoring to ensure reliable ingestion</w:t>
+      </w:r>
+    </w:p>
+    <w:p>
+      <w:pPr>
+        <w:pStyle w:val="List Bullet"/>
+        <w:numPr>
+          <w:ilvl w:val="0"/>
+          <w:numId w:val="2"/>
+        </w:numPr>
+        <w:bidi w:val="0"/>
+        <w:spacing w:after="0"/>
+        <w:ind w:right="0"/>
+        <w:jc w:val="left"/>
+        <w:rPr>
+          <w:rtl w:val="0"/>
+          <w:lang w:val="en-US"/>
+        </w:rPr>
+      </w:pPr>
+      <w:r>
+        <w:rPr>
+          <w:rStyle w:val="None A"/>
+          <w:rtl w:val="0"/>
+          <w:lang w:val="en-US"/>
+        </w:rPr>
+        <w:t>Contributed to delivery of Propensity-to-Purchase and Discount Optimization models via a serverless ML platform (Lambda, SQS, EventBridge, SageMaker), coding a data assessment layer and partnering across teams to source higher-quality purchase data from distributed systems (ClickHouse, Hive)</w:t>
       </w:r>
     </w:p>
     <w:p>
@@ -469,7 +582,7 @@
       </w:pPr>
       <w:r>
         <w:rPr>
-          <w:rStyle w:val="None B"/>
+          <w:rStyle w:val="None A"/>
           <w:rtl w:val="0"/>
           <w:lang w:val="en-US"/>
         </w:rPr>
@@ -494,7 +607,7 @@
       </w:pPr>
       <w:r>
         <w:rPr>
-          <w:rStyle w:val="None B"/>
+          <w:rStyle w:val="None A"/>
           <w:rtl w:val="0"/>
           <w:lang w:val="en-US"/>
         </w:rPr>
@@ -519,7 +632,7 @@
       </w:pPr>
       <w:r>
         <w:rPr>
-          <w:rStyle w:val="None B"/>
+          <w:rStyle w:val="None A"/>
           <w:rtl w:val="0"/>
           <w:lang w:val="en-US"/>
         </w:rPr>
@@ -544,7 +657,7 @@
       </w:pPr>
       <w:r>
         <w:rPr>
-          <w:rStyle w:val="None B"/>
+          <w:rStyle w:val="None A"/>
           <w:rtl w:val="0"/>
           <w:lang w:val="en-US"/>
         </w:rPr>
@@ -569,7 +682,7 @@
       </w:pPr>
       <w:r>
         <w:rPr>
-          <w:rStyle w:val="None B"/>
+          <w:rStyle w:val="None A"/>
           <w:rtl w:val="0"/>
           <w:lang w:val="en-US"/>
         </w:rPr>
@@ -595,7 +708,7 @@
           <w:rtl w:val="0"/>
           <w:lang w:val="en-US"/>
         </w:rPr>
-        <w:t>Machine Learning / Data Platform</w:t>
+        <w:t>Observability &amp; Reliability</w:t>
       </w:r>
     </w:p>
     <w:p>
@@ -616,27 +729,11 @@
       </w:pPr>
       <w:r>
         <w:rPr>
-          <w:rStyle w:val="None B"/>
-          <w:rtl w:val="0"/>
-          <w:lang w:val="en-US"/>
-        </w:rPr>
-        <w:t>Led onboarding of 100+ clients to ML platform over two quarters, designing ingestion pipelines using ClickHouse S3 integration and EventBridge to process multi-terabyte datasets (10</w:t>
-      </w:r>
-      <w:r>
-        <w:rPr>
-          <w:rStyle w:val="None B"/>
-          <w:rtl w:val="0"/>
-          <w:lang w:val="en-US"/>
-        </w:rPr>
-        <w:t>–</w:t>
-      </w:r>
-      <w:r>
-        <w:rPr>
-          <w:rStyle w:val="None B"/>
-          <w:rtl w:val="0"/>
-          <w:lang w:val="en-US"/>
-        </w:rPr>
-        <w:t>50GB per client)</w:t>
+          <w:rStyle w:val="None A"/>
+          <w:rtl w:val="0"/>
+          <w:lang w:val="en-US"/>
+        </w:rPr>
+        <w:t>Led development of a custom observability framework (structured logging, distributed tracing, Prometheus, Grafana) for high-throughput, time-sensitive systems processing thousands of event based messages per minute</w:t>
       </w:r>
     </w:p>
     <w:p>
@@ -657,11 +754,81 @@
       </w:pPr>
       <w:r>
         <w:rPr>
-          <w:rStyle w:val="None B"/>
-          <w:rtl w:val="0"/>
-          <w:lang w:val="en-US"/>
-        </w:rPr>
-        <w:t>Partnered with Analytics to deliver nightly pipelines using Athena and S3, defining ClickHouse queries, implementing client-driven export controls via flag files, enabling cross-team S3 access via AWS SAM, and building monitoring to ensure reliable ingestion</w:t>
+          <w:rStyle w:val="None A"/>
+          <w:rtl w:val="0"/>
+          <w:lang w:val="en-US"/>
+        </w:rPr>
+        <w:t>Improved system reliability and visibility across clients by enabling real-time monitoring, alerting, and faster issue detection and resolution</w:t>
+      </w:r>
+    </w:p>
+    <w:p>
+      <w:pPr>
+        <w:pStyle w:val="List Bullet"/>
+        <w:spacing w:after="0"/>
+      </w:pPr>
+    </w:p>
+    <w:p>
+      <w:pPr>
+        <w:pStyle w:val="Body A"/>
+        <w:spacing w:after="40"/>
+      </w:pPr>
+      <w:r>
+        <w:rPr>
+          <w:rStyle w:val="None"/>
+          <w:b w:val="1"/>
+          <w:bCs w:val="1"/>
+          <w:rtl w:val="0"/>
+          <w:lang w:val="nl-NL"/>
+        </w:rPr>
+        <w:t>Cheetah Digital</w:t>
+      </w:r>
+      <w:r>
+        <w:rPr>
+          <w:rStyle w:val="None"/>
+          <w:b w:val="1"/>
+          <w:bCs w:val="1"/>
+          <w:lang w:val="nl-NL"/>
+        </w:rPr>
+        <w:br w:type="textWrapping"/>
+      </w:r>
+      <w:r>
+        <w:rPr>
+          <w:rStyle w:val="None"/>
+          <w:rtl w:val="0"/>
+          <w:lang w:val="en-US"/>
+        </w:rPr>
+        <w:t>Technical Program Manager / Software Developer</w:t>
+      </w:r>
+      <w:r>
+        <w:rPr>
+          <w:rStyle w:val="None"/>
+          <w:lang w:val="nl-NL"/>
+        </w:rPr>
+        <w:br w:type="textWrapping"/>
+      </w:r>
+      <w:r>
+        <w:rPr>
+          <w:rStyle w:val="None"/>
+          <w:rtl w:val="0"/>
+          <w:lang w:val="nl-NL"/>
+        </w:rPr>
+        <w:t xml:space="preserve">2015 </w:t>
+      </w:r>
+      <w:r>
+        <w:rPr>
+          <w:rStyle w:val="None"/>
+          <w:rtl w:val="0"/>
+          <w:lang w:val="nl-NL"/>
+        </w:rPr>
+        <w:t xml:space="preserve">– </w:t>
+      </w:r>
+      <w:r>
+        <w:rPr>
+          <w:rStyle w:val="None"/>
+          <w:rtl w:val="0"/>
+          <w:lang w:val="en-US"/>
+        </w:rPr>
+        <w:t>2021</w:t>
       </w:r>
     </w:p>
     <w:p>
@@ -682,33 +849,11 @@
       </w:pPr>
       <w:r>
         <w:rPr>
-          <w:rStyle w:val="None B"/>
-          <w:rtl w:val="0"/>
-          <w:lang w:val="en-US"/>
-        </w:rPr>
-        <w:t>Contributed to delivery of Propensity-to-Purchase and Discount Optimization models via a serverless ML platform (Lambda, SQS, EventBridge, SageMaker), coding a data assessment layer and partnering across teams to source higher-quality purchase data from distributed systems (ClickHouse, Hive)</w:t>
-      </w:r>
-    </w:p>
-    <w:p>
-      <w:pPr>
-        <w:pStyle w:val="Body A"/>
-        <w:spacing w:before="80" w:after="0"/>
-        <w:rPr>
-          <w:rStyle w:val="None"/>
-          <w:lang w:val="en-US"/>
-        </w:rPr>
-      </w:pPr>
-      <w:r>
-        <w:rPr>
-          <w:rStyle w:val="None"/>
-          <w:b w:val="1"/>
-          <w:bCs w:val="1"/>
-          <w:sz w:val="24"/>
-          <w:szCs w:val="24"/>
-          <w:rtl w:val="0"/>
-          <w:lang w:val="en-US"/>
-        </w:rPr>
-        <w:t>Observability &amp; Reliability</w:t>
+          <w:rStyle w:val="None A"/>
+          <w:rtl w:val="0"/>
+          <w:lang w:val="en-US"/>
+        </w:rPr>
+        <w:t>Led Agile delivery processes as Scrum Master across multiple engineering teams, improving planning accuracy and execution consistency</w:t>
       </w:r>
     </w:p>
     <w:p>
@@ -729,11 +874,11 @@
       </w:pPr>
       <w:r>
         <w:rPr>
-          <w:rStyle w:val="None B"/>
-          <w:rtl w:val="0"/>
-          <w:lang w:val="en-US"/>
-        </w:rPr>
-        <w:t>Led development of a custom observability framework (structured logging, distributed tracing, Prometheus, Grafana) for high-throughput, time-sensitive systems processing thousands of event based messages per minute</w:t>
+          <w:rStyle w:val="None A"/>
+          <w:rtl w:val="0"/>
+          <w:lang w:val="en-US"/>
+        </w:rPr>
+        <w:t>Coordinated cross-functional efforts between engineering, SRE, and release teams to deliver platform enhancements</w:t>
       </w:r>
     </w:p>
     <w:p>
@@ -754,81 +899,11 @@
       </w:pPr>
       <w:r>
         <w:rPr>
-          <w:rStyle w:val="None B"/>
-          <w:rtl w:val="0"/>
-          <w:lang w:val="en-US"/>
-        </w:rPr>
-        <w:t>Improved system reliability and visibility across clients by enabling real-time monitoring, alerting, and faster issue detection and resolution</w:t>
-      </w:r>
-    </w:p>
-    <w:p>
-      <w:pPr>
-        <w:pStyle w:val="List Bullet"/>
-        <w:spacing w:after="0"/>
-      </w:pPr>
-    </w:p>
-    <w:p>
-      <w:pPr>
-        <w:pStyle w:val="Body A"/>
-        <w:spacing w:after="40"/>
-      </w:pPr>
-      <w:r>
-        <w:rPr>
-          <w:rStyle w:val="None"/>
-          <w:b w:val="1"/>
-          <w:bCs w:val="1"/>
-          <w:rtl w:val="0"/>
-          <w:lang w:val="nl-NL"/>
-        </w:rPr>
-        <w:t>Cheetah Digital</w:t>
-      </w:r>
-      <w:r>
-        <w:rPr>
-          <w:rStyle w:val="None"/>
-          <w:b w:val="1"/>
-          <w:bCs w:val="1"/>
-          <w:lang w:val="nl-NL"/>
-        </w:rPr>
-        <w:br w:type="textWrapping"/>
-      </w:r>
-      <w:r>
-        <w:rPr>
-          <w:rStyle w:val="None"/>
-          <w:rtl w:val="0"/>
-          <w:lang w:val="en-US"/>
-        </w:rPr>
-        <w:t>Technical Program Manager / Software Developer</w:t>
-      </w:r>
-      <w:r>
-        <w:rPr>
-          <w:rStyle w:val="None B A"/>
-          <w:lang w:val="nl-NL"/>
-        </w:rPr>
-        <w:br w:type="textWrapping"/>
-      </w:r>
-      <w:r>
-        <w:rPr>
-          <w:rStyle w:val="None B A"/>
-          <w:rtl w:val="0"/>
-          <w:lang w:val="nl-NL"/>
-        </w:rPr>
-        <w:t xml:space="preserve">2015 </w:t>
-      </w:r>
-      <w:r>
-        <w:rPr>
-          <w:rStyle w:val="None B A"/>
-          <w:rtl w:val="0"/>
-          <w:lang w:val="nl-NL"/>
-        </w:rPr>
-        <w:t xml:space="preserve">– </w:t>
-      </w:r>
-      <w:r>
-        <w:rPr>
-          <w:rStyle w:val="None"/>
-          <w:rtl w:val="0"/>
-          <w:lang w:val="en-US"/>
-        </w:rPr>
-        <w:t>2021</w:t>
+          <w:rStyle w:val="None A"/>
+          <w:rtl w:val="0"/>
+          <w:lang w:val="en-US"/>
+        </w:rPr>
+        <w:t>Contributed to backend services and data processing systems supporting high-volume client workloads</w:t>
       </w:r>
     </w:p>
     <w:p>
@@ -849,11 +924,81 @@
       </w:pPr>
       <w:r>
         <w:rPr>
-          <w:rStyle w:val="None B"/>
-          <w:rtl w:val="0"/>
-          <w:lang w:val="en-US"/>
-        </w:rPr>
-        <w:t>Led Agile delivery processes as Scrum Master across multiple engineering teams, improving planning accuracy and execution consistency</w:t>
+          <w:rStyle w:val="None A"/>
+          <w:rtl w:val="0"/>
+          <w:lang w:val="en-US"/>
+        </w:rPr>
+        <w:t>Partnered directly with clients to support integrations, troubleshoot issues, and ensure successful delivery</w:t>
+      </w:r>
+    </w:p>
+    <w:p>
+      <w:pPr>
+        <w:pStyle w:val="List Bullet"/>
+        <w:spacing w:after="0"/>
+      </w:pPr>
+    </w:p>
+    <w:p>
+      <w:pPr>
+        <w:pStyle w:val="Body A"/>
+        <w:spacing w:after="40"/>
+      </w:pPr>
+      <w:r>
+        <w:rPr>
+          <w:rStyle w:val="None"/>
+          <w:b w:val="1"/>
+          <w:bCs w:val="1"/>
+          <w:rtl w:val="0"/>
+          <w:lang w:val="de-DE"/>
+        </w:rPr>
+        <w:t>CheetahMail / Experian</w:t>
+      </w:r>
+      <w:r>
+        <w:rPr>
+          <w:rStyle w:val="None"/>
+          <w:b w:val="1"/>
+          <w:bCs w:val="1"/>
+          <w:lang w:val="nl-NL"/>
+        </w:rPr>
+        <w:br w:type="textWrapping"/>
+      </w:r>
+      <w:r>
+        <w:rPr>
+          <w:rStyle w:val="None"/>
+          <w:rtl w:val="0"/>
+          <w:lang w:val="en-US"/>
+        </w:rPr>
+        <w:t>Software Developer / Client Solutions Team</w:t>
+      </w:r>
+      <w:r>
+        <w:rPr>
+          <w:rStyle w:val="None"/>
+          <w:lang w:val="nl-NL"/>
+        </w:rPr>
+        <w:br w:type="textWrapping"/>
+      </w:r>
+      <w:r>
+        <w:rPr>
+          <w:rStyle w:val="None"/>
+          <w:rtl w:val="0"/>
+          <w:lang w:val="nl-NL"/>
+        </w:rPr>
+        <w:t xml:space="preserve">2008 </w:t>
+      </w:r>
+      <w:r>
+        <w:rPr>
+          <w:rStyle w:val="None"/>
+          <w:rtl w:val="0"/>
+          <w:lang w:val="nl-NL"/>
+        </w:rPr>
+        <w:t xml:space="preserve">– </w:t>
+      </w:r>
+      <w:r>
+        <w:rPr>
+          <w:rStyle w:val="None"/>
+          <w:rtl w:val="0"/>
+          <w:lang w:val="nl-NL"/>
+        </w:rPr>
+        <w:t>2015</w:t>
       </w:r>
     </w:p>
     <w:p>
@@ -869,16 +1014,16 @@
         <w:jc w:val="left"/>
         <w:rPr>
           <w:rtl w:val="0"/>
-          <w:lang w:val="en-US"/>
-        </w:rPr>
-      </w:pPr>
-      <w:r>
-        <w:rPr>
-          <w:rStyle w:val="None B"/>
-          <w:rtl w:val="0"/>
-          <w:lang w:val="en-US"/>
-        </w:rPr>
-        <w:t>Coordinated cross-functional efforts between engineering, SRE, and release teams to deliver platform enhancements</w:t>
+          <w:lang w:val="nl-NL"/>
+        </w:rPr>
+      </w:pPr>
+      <w:r>
+        <w:rPr>
+          <w:rStyle w:val="None"/>
+          <w:rtl w:val="0"/>
+          <w:lang w:val="nl-NL"/>
+        </w:rPr>
+        <w:t>Scrum master and developer for Cheetahmail development team</w:t>
       </w:r>
     </w:p>
     <w:p>
@@ -894,16 +1039,16 @@
         <w:jc w:val="left"/>
         <w:rPr>
           <w:rtl w:val="0"/>
-          <w:lang w:val="en-US"/>
-        </w:rPr>
-      </w:pPr>
-      <w:r>
-        <w:rPr>
-          <w:rStyle w:val="None B"/>
-          <w:rtl w:val="0"/>
-          <w:lang w:val="en-US"/>
-        </w:rPr>
-        <w:t>Contributed to backend services and data processing systems supporting high-volume client workloads</w:t>
+          <w:lang w:val="nl-NL"/>
+        </w:rPr>
+      </w:pPr>
+      <w:r>
+        <w:rPr>
+          <w:rStyle w:val="None"/>
+          <w:rtl w:val="0"/>
+          <w:lang w:val="nl-NL"/>
+        </w:rPr>
+        <w:t>Design and implement remarketing campaigns for clients. Build automated import processes that client feeds from Coremetrics, Google Analytics, and Omniture to capture abandoned cart users.</w:t>
       </w:r>
     </w:p>
     <w:p>
@@ -924,81 +1069,11 @@
       </w:pPr>
       <w:r>
         <w:rPr>
-          <w:rStyle w:val="None B"/>
-          <w:rtl w:val="0"/>
-          <w:lang w:val="en-US"/>
-        </w:rPr>
-        <w:t>Partnered directly with clients to support integrations, troubleshoot issues, and ensure successful delivery</w:t>
-      </w:r>
-    </w:p>
-    <w:p>
-      <w:pPr>
-        <w:pStyle w:val="List Bullet"/>
-        <w:spacing w:after="0"/>
-      </w:pPr>
-    </w:p>
-    <w:p>
-      <w:pPr>
-        <w:pStyle w:val="Body A"/>
-        <w:spacing w:after="40"/>
-      </w:pPr>
-      <w:r>
-        <w:rPr>
-          <w:rStyle w:val="None"/>
-          <w:b w:val="1"/>
-          <w:bCs w:val="1"/>
-          <w:rtl w:val="0"/>
-          <w:lang w:val="de-DE"/>
-        </w:rPr>
-        <w:t>CheetahMail / Experian</w:t>
-      </w:r>
-      <w:r>
-        <w:rPr>
-          <w:rStyle w:val="None"/>
-          <w:b w:val="1"/>
-          <w:bCs w:val="1"/>
-          <w:lang w:val="nl-NL"/>
-        </w:rPr>
-        <w:br w:type="textWrapping"/>
-      </w:r>
-      <w:r>
-        <w:rPr>
-          <w:rStyle w:val="None"/>
-          <w:rtl w:val="0"/>
-          <w:lang w:val="en-US"/>
-        </w:rPr>
-        <w:t>Software Developer</w:t>
-      </w:r>
-      <w:r>
-        <w:rPr>
-          <w:rStyle w:val="None B A"/>
-          <w:lang w:val="nl-NL"/>
-        </w:rPr>
-        <w:br w:type="textWrapping"/>
-      </w:r>
-      <w:r>
-        <w:rPr>
-          <w:rStyle w:val="None B A"/>
-          <w:rtl w:val="0"/>
-          <w:lang w:val="nl-NL"/>
-        </w:rPr>
-        <w:t xml:space="preserve">2008 </w:t>
-      </w:r>
-      <w:r>
-        <w:rPr>
-          <w:rStyle w:val="None B A"/>
-          <w:rtl w:val="0"/>
-          <w:lang w:val="nl-NL"/>
-        </w:rPr>
-        <w:t xml:space="preserve">– </w:t>
-      </w:r>
-      <w:r>
-        <w:rPr>
-          <w:rStyle w:val="None B A"/>
-          <w:rtl w:val="0"/>
-          <w:lang w:val="nl-NL"/>
-        </w:rPr>
-        <w:t>2015</w:t>
+          <w:rStyle w:val="None A"/>
+          <w:rtl w:val="0"/>
+          <w:lang w:val="en-US"/>
+        </w:rPr>
+        <w:t>Built ETL pipelines for client data ingestion (text/XML) into BerkeleyDB/CDB systems and supported API integrations</w:t>
       </w:r>
     </w:p>
     <w:p>
@@ -1014,77 +1089,17 @@
         <w:jc w:val="left"/>
         <w:rPr>
           <w:rtl w:val="0"/>
-          <w:lang w:val="nl-NL"/>
-        </w:rPr>
-      </w:pPr>
-      <w:r>
-        <w:rPr>
-          <w:rStyle w:val="None B A"/>
-          <w:rtl w:val="0"/>
-          <w:lang w:val="nl-NL"/>
-        </w:rPr>
-        <w:t>Scrum master and developer for Cheetahmail development team</w:t>
-      </w:r>
-    </w:p>
-    <w:p>
-      <w:pPr>
-        <w:pStyle w:val="List Bullet"/>
-        <w:numPr>
-          <w:ilvl w:val="0"/>
-          <w:numId w:val="2"/>
-        </w:numPr>
-        <w:bidi w:val="0"/>
-        <w:spacing w:after="0"/>
-        <w:ind w:right="0"/>
-        <w:jc w:val="left"/>
-        <w:rPr>
-          <w:rtl w:val="0"/>
-          <w:lang w:val="en-US"/>
-        </w:rPr>
-      </w:pPr>
-      <w:r>
-        <w:rPr>
-          <w:rStyle w:val="None B"/>
-          <w:rtl w:val="0"/>
-          <w:lang w:val="en-US"/>
-        </w:rPr>
-        <w:t>Improved reporting performance by implementing bulk data loading solutions using SQL*Loader for high-volume datasets</w:t>
-      </w:r>
-    </w:p>
-    <w:p>
-      <w:pPr>
-        <w:pStyle w:val="List Bullet"/>
-        <w:numPr>
-          <w:ilvl w:val="0"/>
-          <w:numId w:val="2"/>
-        </w:numPr>
-        <w:bidi w:val="0"/>
-        <w:spacing w:after="0"/>
-        <w:ind w:right="0"/>
-        <w:jc w:val="left"/>
-        <w:rPr>
-          <w:rtl w:val="0"/>
-          <w:lang w:val="en-US"/>
-        </w:rPr>
-      </w:pPr>
-      <w:r>
-        <w:rPr>
-          <w:rStyle w:val="None B"/>
-          <w:rtl w:val="0"/>
-          <w:lang w:val="en-US"/>
-        </w:rPr>
-        <w:t>Built ETL pipelines for client data ingestion (text/XML) into BerkeleyDB/CDB systems and supported API integrations</w:t>
-      </w:r>
-    </w:p>
-    <w:p>
-      <w:pPr>
-        <w:pStyle w:val="List Bullet"/>
-        <w:numPr>
-          <w:ilvl w:val="0"/>
-          <w:numId w:val="2"/>
-        </w:numPr>
-        <w:spacing w:after="0"/>
-      </w:pPr>
+          <w:lang w:val="en-US"/>
+        </w:rPr>
+      </w:pPr>
+      <w:r>
+        <w:rPr>
+          <w:rStyle w:val="None A"/>
+          <w:rtl w:val="0"/>
+          <w:lang w:val="en-US"/>
+        </w:rPr>
+        <w:t>Integrated client imports/exports. Work closely with clients to design and implement customized solutions, aggregating campaign data to synch with client or 3rd party DB</w:t>
+      </w:r>
     </w:p>
     <w:p>
       <w:pPr>
@@ -1195,7 +1210,7 @@
           <w:rtl w:val="0"/>
           <w:lang w:val="en-US"/>
         </w:rPr>
-        <w:t>Tools: Git, Bitbucket, Jira, Confluence, Swagger/OpenAPI, Docker, GitHub Copilot, Cursor</w:t>
+        <w:t>Tools: Git (Bitbucket), Jira, Confluence, Swagger/OpenAPI, Docker, GitHub Copilot, Cursor</w:t>
       </w:r>
     </w:p>
     <w:p>
@@ -1209,7 +1224,7 @@
         <w:pStyle w:val="Body A"/>
         <w:spacing w:after="0"/>
         <w:rPr>
-          <w:rStyle w:val="None B"/>
+          <w:rStyle w:val="None A"/>
         </w:rPr>
       </w:pPr>
       <w:r>
@@ -1235,6 +1250,14 @@
           <w:lang w:val="de-DE"/>
         </w:rPr>
         <w:t>Tulane University</w:t>
+      </w:r>
+      <w:r>
+        <w:rPr>
+          <w:rStyle w:val="None"/>
+          <w:rtl w:val="0"/>
+          <w:lang w:val="en-US"/>
+        </w:rPr>
+        <w:t xml:space="preserve"> - 1998</w:t>
       </w:r>
     </w:p>
     <w:p>
@@ -1806,12 +1829,6 @@
       </w14:textFill>
     </w:rPr>
   </w:style>
-  <w:style w:type="character" w:styleId="None B A">
-    <w:name w:val="None B A"/>
-    <w:rPr>
-      <w:lang w:val="nl-NL"/>
-    </w:rPr>
-  </w:style>
   <w:style w:type="character" w:styleId="None">
     <w:name w:val="None"/>
   </w:style>
@@ -1847,8 +1864,8 @@
       </w14:textFill>
     </w:rPr>
   </w:style>
-  <w:style w:type="character" w:styleId="None B">
-    <w:name w:val="None B"/>
+  <w:style w:type="character" w:styleId="None A">
+    <w:name w:val="None A"/>
     <w:rPr>
       <w:lang w:val="nl-NL"/>
     </w:rPr>

</xml_diff>

<commit_message>
minor resume update to mention client solutions
</commit_message>
<xml_diff>
--- a/public/docs/reidcollins.docx
+++ b/public/docs/reidcollins.docx
@@ -175,8 +175,9 @@
       </w:pPr>
       <w:r>
         <w:rPr>
-          <w:rStyle w:val="None A"/>
-          <w:rtl w:val="0"/>
+          <w:rStyle w:val="None"/>
+          <w:rtl w:val="0"/>
+          <w:lang w:val="nl-NL"/>
         </w:rPr>
         <w:t>Open to Senior Technical Program Manager, Platform, and Infrastructure roles</w:t>
       </w:r>
@@ -347,7 +348,7 @@
       </w:pPr>
       <w:r>
         <w:rPr>
-          <w:rStyle w:val="None A"/>
+          <w:rStyle w:val="None"/>
           <w:rtl w:val="0"/>
           <w:lang w:val="en-US"/>
         </w:rPr>
@@ -372,7 +373,7 @@
       </w:pPr>
       <w:r>
         <w:rPr>
-          <w:rStyle w:val="None A"/>
+          <w:rStyle w:val="None"/>
           <w:rtl w:val="0"/>
           <w:lang w:val="en-US"/>
         </w:rPr>
@@ -397,7 +398,7 @@
       </w:pPr>
       <w:r>
         <w:rPr>
-          <w:rStyle w:val="None A"/>
+          <w:rStyle w:val="None"/>
           <w:rtl w:val="0"/>
           <w:lang w:val="en-US"/>
         </w:rPr>
@@ -422,7 +423,7 @@
       </w:pPr>
       <w:r>
         <w:rPr>
-          <w:rStyle w:val="None A"/>
+          <w:rStyle w:val="None"/>
           <w:rtl w:val="0"/>
           <w:lang w:val="en-US"/>
         </w:rPr>
@@ -469,7 +470,7 @@
       </w:pPr>
       <w:r>
         <w:rPr>
-          <w:rStyle w:val="None A"/>
+          <w:rStyle w:val="None"/>
           <w:rtl w:val="0"/>
           <w:lang w:val="en-US"/>
         </w:rPr>
@@ -477,7 +478,7 @@
       </w:r>
       <w:r>
         <w:rPr>
-          <w:rStyle w:val="None A"/>
+          <w:rStyle w:val="None"/>
           <w:rtl w:val="0"/>
           <w:lang w:val="en-US"/>
         </w:rPr>
@@ -485,7 +486,7 @@
       </w:r>
       <w:r>
         <w:rPr>
-          <w:rStyle w:val="None A"/>
+          <w:rStyle w:val="None"/>
           <w:rtl w:val="0"/>
           <w:lang w:val="en-US"/>
         </w:rPr>
@@ -510,7 +511,7 @@
       </w:pPr>
       <w:r>
         <w:rPr>
-          <w:rStyle w:val="None A"/>
+          <w:rStyle w:val="None"/>
           <w:rtl w:val="0"/>
           <w:lang w:val="en-US"/>
         </w:rPr>
@@ -535,7 +536,7 @@
       </w:pPr>
       <w:r>
         <w:rPr>
-          <w:rStyle w:val="None A"/>
+          <w:rStyle w:val="None"/>
           <w:rtl w:val="0"/>
           <w:lang w:val="en-US"/>
         </w:rPr>
@@ -582,7 +583,7 @@
       </w:pPr>
       <w:r>
         <w:rPr>
-          <w:rStyle w:val="None A"/>
+          <w:rStyle w:val="None"/>
           <w:rtl w:val="0"/>
           <w:lang w:val="en-US"/>
         </w:rPr>
@@ -607,7 +608,7 @@
       </w:pPr>
       <w:r>
         <w:rPr>
-          <w:rStyle w:val="None A"/>
+          <w:rStyle w:val="None"/>
           <w:rtl w:val="0"/>
           <w:lang w:val="en-US"/>
         </w:rPr>
@@ -632,7 +633,7 @@
       </w:pPr>
       <w:r>
         <w:rPr>
-          <w:rStyle w:val="None A"/>
+          <w:rStyle w:val="None"/>
           <w:rtl w:val="0"/>
           <w:lang w:val="en-US"/>
         </w:rPr>
@@ -657,7 +658,7 @@
       </w:pPr>
       <w:r>
         <w:rPr>
-          <w:rStyle w:val="None A"/>
+          <w:rStyle w:val="None"/>
           <w:rtl w:val="0"/>
           <w:lang w:val="en-US"/>
         </w:rPr>
@@ -682,7 +683,7 @@
       </w:pPr>
       <w:r>
         <w:rPr>
-          <w:rStyle w:val="None A"/>
+          <w:rStyle w:val="None"/>
           <w:rtl w:val="0"/>
           <w:lang w:val="en-US"/>
         </w:rPr>
@@ -729,7 +730,7 @@
       </w:pPr>
       <w:r>
         <w:rPr>
-          <w:rStyle w:val="None A"/>
+          <w:rStyle w:val="None"/>
           <w:rtl w:val="0"/>
           <w:lang w:val="en-US"/>
         </w:rPr>
@@ -754,7 +755,7 @@
       </w:pPr>
       <w:r>
         <w:rPr>
-          <w:rStyle w:val="None A"/>
+          <w:rStyle w:val="None"/>
           <w:rtl w:val="0"/>
           <w:lang w:val="en-US"/>
         </w:rPr>
@@ -849,7 +850,7 @@
       </w:pPr>
       <w:r>
         <w:rPr>
-          <w:rStyle w:val="None A"/>
+          <w:rStyle w:val="None"/>
           <w:rtl w:val="0"/>
           <w:lang w:val="en-US"/>
         </w:rPr>
@@ -874,7 +875,7 @@
       </w:pPr>
       <w:r>
         <w:rPr>
-          <w:rStyle w:val="None A"/>
+          <w:rStyle w:val="None"/>
           <w:rtl w:val="0"/>
           <w:lang w:val="en-US"/>
         </w:rPr>
@@ -899,7 +900,7 @@
       </w:pPr>
       <w:r>
         <w:rPr>
-          <w:rStyle w:val="None A"/>
+          <w:rStyle w:val="None"/>
           <w:rtl w:val="0"/>
           <w:lang w:val="en-US"/>
         </w:rPr>
@@ -924,7 +925,7 @@
       </w:pPr>
       <w:r>
         <w:rPr>
-          <w:rStyle w:val="None A"/>
+          <w:rStyle w:val="None"/>
           <w:rtl w:val="0"/>
           <w:lang w:val="en-US"/>
         </w:rPr>
@@ -1023,7 +1024,31 @@
           <w:rtl w:val="0"/>
           <w:lang w:val="nl-NL"/>
         </w:rPr>
-        <w:t>Scrum master and developer for Cheetahmail development team</w:t>
+        <w:t xml:space="preserve">Scrum master and developer for Cheetahmail development </w:t>
+      </w:r>
+      <w:r>
+        <w:rPr>
+          <w:rStyle w:val="None"/>
+          <w:rtl w:val="0"/>
+          <w:lang w:val="nl-NL"/>
+        </w:rPr>
+        <w:t xml:space="preserve">client solutions </w:t>
+      </w:r>
+      <w:r>
+        <w:rPr>
+          <w:rStyle w:val="None"/>
+          <w:rtl w:val="0"/>
+          <w:lang w:val="nl-NL"/>
+        </w:rPr>
+        <w:t>team</w:t>
+      </w:r>
+      <w:r>
+        <w:rPr>
+          <w:rStyle w:val="None"/>
+          <w:rtl w:val="0"/>
+          <w:lang w:val="nl-NL"/>
+        </w:rPr>
+        <w:t>s</w:t>
       </w:r>
     </w:p>
     <w:p>
@@ -1069,7 +1094,7 @@
       </w:pPr>
       <w:r>
         <w:rPr>
-          <w:rStyle w:val="None A"/>
+          <w:rStyle w:val="None"/>
           <w:rtl w:val="0"/>
           <w:lang w:val="en-US"/>
         </w:rPr>
@@ -1094,7 +1119,7 @@
       </w:pPr>
       <w:r>
         <w:rPr>
-          <w:rStyle w:val="None A"/>
+          <w:rStyle w:val="None"/>
           <w:rtl w:val="0"/>
           <w:lang w:val="en-US"/>
         </w:rPr>
@@ -1224,7 +1249,7 @@
         <w:pStyle w:val="Body A"/>
         <w:spacing w:after="0"/>
         <w:rPr>
-          <w:rStyle w:val="None A"/>
+          <w:rStyle w:val="None"/>
         </w:rPr>
       </w:pPr>
       <w:r>
@@ -1862,12 +1887,6 @@
           <w14:srgbClr w14:val="0000FF"/>
         </w14:solidFill>
       </w14:textFill>
-    </w:rPr>
-  </w:style>
-  <w:style w:type="character" w:styleId="None A">
-    <w:name w:val="None A"/>
-    <w:rPr>
-      <w:lang w:val="nl-NL"/>
     </w:rPr>
   </w:style>
   <w:style w:type="paragraph" w:styleId="List Bullet">

</xml_diff>

<commit_message>
update public resumes with new AWS cert
</commit_message>
<xml_diff>
--- a/public/docs/reidcollins.docx
+++ b/public/docs/reidcollins.docx
@@ -175,9 +175,8 @@
       </w:pPr>
       <w:r>
         <w:rPr>
-          <w:rStyle w:val="None"/>
-          <w:rtl w:val="0"/>
-          <w:lang w:val="nl-NL"/>
+          <w:rStyle w:val="None A"/>
+          <w:rtl w:val="0"/>
         </w:rPr>
         <w:t>Open to Senior Technical Program Manager, Platform, and Infrastructure roles</w:t>
       </w:r>
@@ -348,7 +347,7 @@
       </w:pPr>
       <w:r>
         <w:rPr>
-          <w:rStyle w:val="None"/>
+          <w:rStyle w:val="None A"/>
           <w:rtl w:val="0"/>
           <w:lang w:val="en-US"/>
         </w:rPr>
@@ -373,7 +372,7 @@
       </w:pPr>
       <w:r>
         <w:rPr>
-          <w:rStyle w:val="None"/>
+          <w:rStyle w:val="None A"/>
           <w:rtl w:val="0"/>
           <w:lang w:val="en-US"/>
         </w:rPr>
@@ -398,7 +397,7 @@
       </w:pPr>
       <w:r>
         <w:rPr>
-          <w:rStyle w:val="None"/>
+          <w:rStyle w:val="None A"/>
           <w:rtl w:val="0"/>
           <w:lang w:val="en-US"/>
         </w:rPr>
@@ -423,7 +422,7 @@
       </w:pPr>
       <w:r>
         <w:rPr>
-          <w:rStyle w:val="None"/>
+          <w:rStyle w:val="None A"/>
           <w:rtl w:val="0"/>
           <w:lang w:val="en-US"/>
         </w:rPr>
@@ -470,7 +469,7 @@
       </w:pPr>
       <w:r>
         <w:rPr>
-          <w:rStyle w:val="None"/>
+          <w:rStyle w:val="None A"/>
           <w:rtl w:val="0"/>
           <w:lang w:val="en-US"/>
         </w:rPr>
@@ -478,7 +477,7 @@
       </w:r>
       <w:r>
         <w:rPr>
-          <w:rStyle w:val="None"/>
+          <w:rStyle w:val="None A"/>
           <w:rtl w:val="0"/>
           <w:lang w:val="en-US"/>
         </w:rPr>
@@ -486,7 +485,7 @@
       </w:r>
       <w:r>
         <w:rPr>
-          <w:rStyle w:val="None"/>
+          <w:rStyle w:val="None A"/>
           <w:rtl w:val="0"/>
           <w:lang w:val="en-US"/>
         </w:rPr>
@@ -511,7 +510,7 @@
       </w:pPr>
       <w:r>
         <w:rPr>
-          <w:rStyle w:val="None"/>
+          <w:rStyle w:val="None A"/>
           <w:rtl w:val="0"/>
           <w:lang w:val="en-US"/>
         </w:rPr>
@@ -536,7 +535,7 @@
       </w:pPr>
       <w:r>
         <w:rPr>
-          <w:rStyle w:val="None"/>
+          <w:rStyle w:val="None A"/>
           <w:rtl w:val="0"/>
           <w:lang w:val="en-US"/>
         </w:rPr>
@@ -583,7 +582,7 @@
       </w:pPr>
       <w:r>
         <w:rPr>
-          <w:rStyle w:val="None"/>
+          <w:rStyle w:val="None A"/>
           <w:rtl w:val="0"/>
           <w:lang w:val="en-US"/>
         </w:rPr>
@@ -608,7 +607,7 @@
       </w:pPr>
       <w:r>
         <w:rPr>
-          <w:rStyle w:val="None"/>
+          <w:rStyle w:val="None A"/>
           <w:rtl w:val="0"/>
           <w:lang w:val="en-US"/>
         </w:rPr>
@@ -633,7 +632,7 @@
       </w:pPr>
       <w:r>
         <w:rPr>
-          <w:rStyle w:val="None"/>
+          <w:rStyle w:val="None A"/>
           <w:rtl w:val="0"/>
           <w:lang w:val="en-US"/>
         </w:rPr>
@@ -658,7 +657,7 @@
       </w:pPr>
       <w:r>
         <w:rPr>
-          <w:rStyle w:val="None"/>
+          <w:rStyle w:val="None A"/>
           <w:rtl w:val="0"/>
           <w:lang w:val="en-US"/>
         </w:rPr>
@@ -683,7 +682,7 @@
       </w:pPr>
       <w:r>
         <w:rPr>
-          <w:rStyle w:val="None"/>
+          <w:rStyle w:val="None A"/>
           <w:rtl w:val="0"/>
           <w:lang w:val="en-US"/>
         </w:rPr>
@@ -730,7 +729,7 @@
       </w:pPr>
       <w:r>
         <w:rPr>
-          <w:rStyle w:val="None"/>
+          <w:rStyle w:val="None A"/>
           <w:rtl w:val="0"/>
           <w:lang w:val="en-US"/>
         </w:rPr>
@@ -755,7 +754,7 @@
       </w:pPr>
       <w:r>
         <w:rPr>
-          <w:rStyle w:val="None"/>
+          <w:rStyle w:val="None A"/>
           <w:rtl w:val="0"/>
           <w:lang w:val="en-US"/>
         </w:rPr>
@@ -850,7 +849,7 @@
       </w:pPr>
       <w:r>
         <w:rPr>
-          <w:rStyle w:val="None"/>
+          <w:rStyle w:val="None A"/>
           <w:rtl w:val="0"/>
           <w:lang w:val="en-US"/>
         </w:rPr>
@@ -875,7 +874,7 @@
       </w:pPr>
       <w:r>
         <w:rPr>
-          <w:rStyle w:val="None"/>
+          <w:rStyle w:val="None A"/>
           <w:rtl w:val="0"/>
           <w:lang w:val="en-US"/>
         </w:rPr>
@@ -900,7 +899,7 @@
       </w:pPr>
       <w:r>
         <w:rPr>
-          <w:rStyle w:val="None"/>
+          <w:rStyle w:val="None A"/>
           <w:rtl w:val="0"/>
           <w:lang w:val="en-US"/>
         </w:rPr>
@@ -925,7 +924,7 @@
       </w:pPr>
       <w:r>
         <w:rPr>
-          <w:rStyle w:val="None"/>
+          <w:rStyle w:val="None A"/>
           <w:rtl w:val="0"/>
           <w:lang w:val="en-US"/>
         </w:rPr>
@@ -1024,31 +1023,7 @@
           <w:rtl w:val="0"/>
           <w:lang w:val="nl-NL"/>
         </w:rPr>
-        <w:t xml:space="preserve">Scrum master and developer for Cheetahmail development </w:t>
-      </w:r>
-      <w:r>
-        <w:rPr>
-          <w:rStyle w:val="None"/>
-          <w:rtl w:val="0"/>
-          <w:lang w:val="nl-NL"/>
-        </w:rPr>
-        <w:t xml:space="preserve">and client solutions </w:t>
-      </w:r>
-      <w:r>
-        <w:rPr>
-          <w:rStyle w:val="None"/>
-          <w:rtl w:val="0"/>
-          <w:lang w:val="nl-NL"/>
-        </w:rPr>
-        <w:t>team</w:t>
-      </w:r>
-      <w:r>
-        <w:rPr>
-          <w:rStyle w:val="None"/>
-          <w:rtl w:val="0"/>
-          <w:lang w:val="nl-NL"/>
-        </w:rPr>
-        <w:t>s</w:t>
+        <w:t>Scrum master and developer for Cheetahmail development and client solutions teams</w:t>
       </w:r>
     </w:p>
     <w:p>
@@ -1094,7 +1069,7 @@
       </w:pPr>
       <w:r>
         <w:rPr>
-          <w:rStyle w:val="None"/>
+          <w:rStyle w:val="None A"/>
           <w:rtl w:val="0"/>
           <w:lang w:val="en-US"/>
         </w:rPr>
@@ -1119,7 +1094,7 @@
       </w:pPr>
       <w:r>
         <w:rPr>
-          <w:rStyle w:val="None"/>
+          <w:rStyle w:val="None A"/>
           <w:rtl w:val="0"/>
           <w:lang w:val="en-US"/>
         </w:rPr>
@@ -1249,7 +1224,7 @@
         <w:pStyle w:val="Body A"/>
         <w:spacing w:after="0"/>
         <w:rPr>
-          <w:rStyle w:val="None"/>
+          <w:rStyle w:val="None A"/>
         </w:rPr>
       </w:pPr>
       <w:r>
@@ -1296,7 +1271,23 @@
           <w:rtl w:val="0"/>
           <w:lang w:val="en-US"/>
         </w:rPr>
-        <w:t>Certifications: Certified Scrum Master (CSM)</w:t>
+        <w:t xml:space="preserve">Certifications: </w:t>
+      </w:r>
+      <w:r>
+        <w:rPr>
+          <w:rStyle w:val="None"/>
+          <w:rtl w:val="0"/>
+          <w:lang w:val="en-US"/>
+        </w:rPr>
+        <w:t xml:space="preserve">AWS Solutions Architect - Associate, </w:t>
+      </w:r>
+      <w:r>
+        <w:rPr>
+          <w:rStyle w:val="None"/>
+          <w:rtl w:val="0"/>
+          <w:lang w:val="en-US"/>
+        </w:rPr>
+        <w:t>Certified Scrum Master (CSM)</w:t>
       </w:r>
     </w:p>
     <w:sectPr>
@@ -1887,6 +1878,12 @@
           <w14:srgbClr w14:val="0000FF"/>
         </w14:solidFill>
       </w14:textFill>
+    </w:rPr>
+  </w:style>
+  <w:style w:type="character" w:styleId="None A">
+    <w:name w:val="None A"/>
+    <w:rPr>
+      <w:lang w:val="nl-NL"/>
     </w:rPr>
   </w:style>
   <w:style w:type="paragraph" w:styleId="List Bullet">

</xml_diff>

<commit_message>
small changes to resume to reflect recent projects. also give more of a tech solutions signal
</commit_message>
<xml_diff>
--- a/public/docs/reidcollins.docx
+++ b/public/docs/reidcollins.docx
@@ -25,6 +25,7 @@
       </w:pPr>
       <w:r>
         <w:rPr>
+          <w:rStyle w:val="None A A"/>
           <w:rtl w:val="0"/>
           <w:lang w:val="nl-NL"/>
         </w:rPr>
@@ -218,7 +219,7 @@
           <w:rtl w:val="0"/>
           <w:lang w:val="en-US"/>
         </w:rPr>
-        <w:t>Senior Technical Program Manager / Backend Engineer with a hybrid background in software engineering and program leadership. Proven track record of driving large-scale platform migrations, leading cross-functional initiatives, and delivering production systems on AWS.</w:t>
+        <w:t>Senior Technical Program Manager / Backend Engineer with a hybrid background in software engineering, program leadership, and client-facing technical delivery. Proven track record of driving large-scale platform migrations, leading cross-functional initiatives, translating business requirements into production systems, and delivering scalable solutions on AWS.</w:t>
       </w:r>
     </w:p>
     <w:p>
@@ -277,7 +278,7 @@
       </w:r>
       <w:r>
         <w:rPr>
-          <w:rStyle w:val="None"/>
+          <w:rStyle w:val="None A A"/>
           <w:lang w:val="nl-NL"/>
         </w:rPr>
         <w:br w:type="textWrapping"/>
@@ -292,7 +293,7 @@
       </w:r>
       <w:r>
         <w:rPr>
-          <w:rStyle w:val="None"/>
+          <w:rStyle w:val="None A A"/>
           <w:rtl w:val="0"/>
           <w:lang w:val="nl-NL"/>
         </w:rPr>
@@ -300,7 +301,7 @@
       </w:r>
       <w:r>
         <w:rPr>
-          <w:rStyle w:val="None"/>
+          <w:rStyle w:val="None A A"/>
           <w:rtl w:val="0"/>
           <w:lang w:val="nl-NL"/>
         </w:rPr>
@@ -426,7 +427,7 @@
           <w:rtl w:val="0"/>
           <w:lang w:val="en-US"/>
         </w:rPr>
-        <w:t>Established and enforced team execution processes (sprint planning, backlog grooming, retrospectives), improving delivery consistency and visibility in a Kanban environment</w:t>
+        <w:t>Established team execution processes and built Jira/Notion/n8n automation workflows for delivery tracking, stakeholder reporting, and stale-ticket visibility, improving execution discipline across cross-functional initiatives</w:t>
       </w:r>
     </w:p>
     <w:p>
@@ -473,7 +474,7 @@
           <w:rtl w:val="0"/>
           <w:lang w:val="en-US"/>
         </w:rPr>
-        <w:t>Led onboarding of 100+ clients to ML platform over two quarters, designing ingestion pipelines using ClickHouse S3 integration and EventBridge to process multi-terabyte datasets (10</w:t>
+        <w:t>Led onboarding of 100+ clients to ML platform over two quarters, translating client data requirements into ingestion pipelines using ClickHouse S3 integration and EventBridge to process multi-terabyte datasets (10</w:t>
       </w:r>
       <w:r>
         <w:rPr>
@@ -636,7 +637,7 @@
           <w:rtl w:val="0"/>
           <w:lang w:val="en-US"/>
         </w:rPr>
-        <w:t>Coordinated migration of image caching infrastructure from Akamai to Cloudflare, updating image caching code base, partnering with clients to install updated domain certs</w:t>
+        <w:t>Coordinated migration of image caching infrastructure from Akamai to Cloudflare, updating application code and partnering with clients to manage domain certificate changes</w:t>
       </w:r>
     </w:p>
     <w:p>
@@ -686,7 +687,7 @@
           <w:rtl w:val="0"/>
           <w:lang w:val="en-US"/>
         </w:rPr>
-        <w:t>Defined API contracts using Swagger/OpenAPI to support cross-team and client integrations</w:t>
+        <w:t>Defined API contracts using Swagger/OpenAPI to support cross-team and client-facing integrations, improving implementation clarity across engineering, SRE, and partner teams</w:t>
       </w:r>
     </w:p>
     <w:p>
@@ -758,7 +759,7 @@
           <w:rtl w:val="0"/>
           <w:lang w:val="en-US"/>
         </w:rPr>
-        <w:t>Improved system reliability and visibility across clients by enabling real-time monitoring, alerting, and faster issue detection and resolution</w:t>
+        <w:t>Built AI-powered incident summarization system using AWS Lambda, SAM, DynamoDB, Claude, Slack, and Jira to ingest alerts from CloudWatch, Datadog, and GitHub Actions, deduplicate incidents, and generate operational summaries</w:t>
       </w:r>
     </w:p>
     <w:p>
@@ -801,14 +802,14 @@
       </w:r>
       <w:r>
         <w:rPr>
-          <w:rStyle w:val="None"/>
+          <w:rStyle w:val="None A A"/>
           <w:lang w:val="nl-NL"/>
         </w:rPr>
         <w:br w:type="textWrapping"/>
       </w:r>
       <w:r>
         <w:rPr>
-          <w:rStyle w:val="None"/>
+          <w:rStyle w:val="None A A"/>
           <w:rtl w:val="0"/>
           <w:lang w:val="nl-NL"/>
         </w:rPr>
@@ -816,7 +817,7 @@
       </w:r>
       <w:r>
         <w:rPr>
-          <w:rStyle w:val="None"/>
+          <w:rStyle w:val="None A A"/>
           <w:rtl w:val="0"/>
           <w:lang w:val="nl-NL"/>
         </w:rPr>
@@ -928,7 +929,7 @@
           <w:rtl w:val="0"/>
           <w:lang w:val="en-US"/>
         </w:rPr>
-        <w:t>Partnered directly with clients to support integrations, troubleshoot issues, and ensure successful delivery</w:t>
+        <w:t>Partnered directly with enterprise clients to scope integrations, troubleshoot data and workflow issues, and translate client requirements into backend delivery plans</w:t>
       </w:r>
     </w:p>
     <w:p>
@@ -971,14 +972,14 @@
       </w:r>
       <w:r>
         <w:rPr>
-          <w:rStyle w:val="None"/>
+          <w:rStyle w:val="None A A"/>
           <w:lang w:val="nl-NL"/>
         </w:rPr>
         <w:br w:type="textWrapping"/>
       </w:r>
       <w:r>
         <w:rPr>
-          <w:rStyle w:val="None"/>
+          <w:rStyle w:val="None A A"/>
           <w:rtl w:val="0"/>
           <w:lang w:val="nl-NL"/>
         </w:rPr>
@@ -986,7 +987,7 @@
       </w:r>
       <w:r>
         <w:rPr>
-          <w:rStyle w:val="None"/>
+          <w:rStyle w:val="None A A"/>
           <w:rtl w:val="0"/>
           <w:lang w:val="nl-NL"/>
         </w:rPr>
@@ -994,7 +995,7 @@
       </w:r>
       <w:r>
         <w:rPr>
-          <w:rStyle w:val="None"/>
+          <w:rStyle w:val="None A A"/>
           <w:rtl w:val="0"/>
           <w:lang w:val="nl-NL"/>
         </w:rPr>
@@ -1019,11 +1020,11 @@
       </w:pPr>
       <w:r>
         <w:rPr>
-          <w:rStyle w:val="None"/>
+          <w:rStyle w:val="None A A"/>
           <w:rtl w:val="0"/>
           <w:lang w:val="nl-NL"/>
         </w:rPr>
-        <w:t>Scrum master and developer for Cheetahmail development and client solutions teams</w:t>
+        <w:t>Served as developer and Scrum Master across product development and client solutions teams, partnering with clients, account teams, and engineering to deliver custom technical solutions</w:t>
       </w:r>
     </w:p>
     <w:p>
@@ -1044,11 +1045,11 @@
       </w:pPr>
       <w:r>
         <w:rPr>
-          <w:rStyle w:val="None"/>
+          <w:rStyle w:val="None A A"/>
           <w:rtl w:val="0"/>
           <w:lang w:val="nl-NL"/>
         </w:rPr>
-        <w:t>Design and implement remarketing campaigns for clients. Build automated import processes that client feeds from Coremetrics, Google Analytics, and Omniture to capture abandoned cart users.</w:t>
+        <w:t>Designed and implemented client-specific remarketing and personalization campaigns using behavioral data from Coremetrics, Google Analytics, and Omniture, including abandoned-cart and browse-recovery workflows</w:t>
       </w:r>
     </w:p>
     <w:p>
@@ -1073,7 +1074,7 @@
           <w:rtl w:val="0"/>
           <w:lang w:val="en-US"/>
         </w:rPr>
-        <w:t>Built ETL pipelines for client data ingestion (text/XML) into BerkeleyDB/CDB systems and supported API integrations</w:t>
+        <w:t>Built automated ETL pipelines to ingest, parse, validate, and transform client data feeds in text and XML formats into BerkeleyDB/CDB-backed systems</w:t>
       </w:r>
     </w:p>
     <w:p>
@@ -1098,7 +1099,7 @@
           <w:rtl w:val="0"/>
           <w:lang w:val="en-US"/>
         </w:rPr>
-        <w:t>Integrated client imports/exports. Work closely with clients to design and implement customized solutions, aggregating campaign data to synch with client or 3rd party DB</w:t>
+        <w:t>Integrated client imports, exports, and APIs, translating business requirements into scalable data workflows and third-party platform integrations</w:t>
       </w:r>
     </w:p>
     <w:p>
@@ -1138,7 +1139,39 @@
           <w:rtl w:val="0"/>
           <w:lang w:val="en-US"/>
         </w:rPr>
-        <w:t>Languages: Python, Perl, Ruby, Bash</w:t>
+        <w:t xml:space="preserve">Languages: Python, </w:t>
+      </w:r>
+      <w:r>
+        <w:rPr>
+          <w:rStyle w:val="None"/>
+          <w:rtl w:val="0"/>
+          <w:lang w:val="en-US"/>
+        </w:rPr>
+        <w:t>Ruby</w:t>
+      </w:r>
+      <w:r>
+        <w:rPr>
+          <w:rStyle w:val="None"/>
+          <w:rtl w:val="0"/>
+          <w:lang w:val="en-US"/>
+        </w:rPr>
+        <w:t xml:space="preserve">, </w:t>
+      </w:r>
+      <w:r>
+        <w:rPr>
+          <w:rStyle w:val="None"/>
+          <w:rtl w:val="0"/>
+          <w:lang w:val="en-US"/>
+        </w:rPr>
+        <w:t>Perl</w:t>
+      </w:r>
+      <w:r>
+        <w:rPr>
+          <w:rStyle w:val="None"/>
+          <w:rtl w:val="0"/>
+          <w:lang w:val="en-US"/>
+        </w:rPr>
+        <w:t>, Bash</w:t>
       </w:r>
     </w:p>
     <w:p>
@@ -1210,7 +1243,15 @@
           <w:rtl w:val="0"/>
           <w:lang w:val="en-US"/>
         </w:rPr>
-        <w:t>Tools: Git (Bitbucket), Jira, Confluence, Swagger/OpenAPI, Docker, GitHub Copilot, Cursor</w:t>
+        <w:t>Tools: Git (Bitbucket), Jira, Confluence, Swagger/OpenAPI, Docker, Cursor</w:t>
+      </w:r>
+      <w:r>
+        <w:rPr>
+          <w:rStyle w:val="None"/>
+          <w:rtl w:val="0"/>
+          <w:lang w:val="en-US"/>
+        </w:rPr>
+        <w:t>, Notion, n8n</w:t>
       </w:r>
     </w:p>
     <w:p>
@@ -1271,23 +1312,7 @@
           <w:rtl w:val="0"/>
           <w:lang w:val="en-US"/>
         </w:rPr>
-        <w:t xml:space="preserve">Certifications: </w:t>
-      </w:r>
-      <w:r>
-        <w:rPr>
-          <w:rStyle w:val="None"/>
-          <w:rtl w:val="0"/>
-          <w:lang w:val="en-US"/>
-        </w:rPr>
-        <w:t xml:space="preserve">AWS Solutions Architect - Associate, </w:t>
-      </w:r>
-      <w:r>
-        <w:rPr>
-          <w:rStyle w:val="None"/>
-          <w:rtl w:val="0"/>
-          <w:lang w:val="en-US"/>
-        </w:rPr>
-        <w:t>Certified Scrum Master (CSM)</w:t>
+        <w:t>Certifications: AWS Solutions Architect - Associate, Certified Scrum Master (CSM)</w:t>
       </w:r>
     </w:p>
     <w:sectPr>
@@ -1843,6 +1868,12 @@
           <w14:srgbClr w14:val="000000"/>
         </w14:solidFill>
       </w14:textFill>
+    </w:rPr>
+  </w:style>
+  <w:style w:type="character" w:styleId="None A A">
+    <w:name w:val="None A A"/>
+    <w:rPr>
+      <w:lang w:val="nl-NL"/>
     </w:rPr>
   </w:style>
   <w:style w:type="character" w:styleId="None">

</xml_diff>

<commit_message>
remove graduation year. add bottom padding to education section
</commit_message>
<xml_diff>
--- a/public/docs/reidcollins.docx
+++ b/public/docs/reidcollins.docx
@@ -1139,39 +1139,7 @@
           <w:rtl w:val="0"/>
           <w:lang w:val="en-US"/>
         </w:rPr>
-        <w:t xml:space="preserve">Languages: Python, </w:t>
-      </w:r>
-      <w:r>
-        <w:rPr>
-          <w:rStyle w:val="None"/>
-          <w:rtl w:val="0"/>
-          <w:lang w:val="en-US"/>
-        </w:rPr>
-        <w:t>Ruby</w:t>
-      </w:r>
-      <w:r>
-        <w:rPr>
-          <w:rStyle w:val="None"/>
-          <w:rtl w:val="0"/>
-          <w:lang w:val="en-US"/>
-        </w:rPr>
-        <w:t xml:space="preserve">, </w:t>
-      </w:r>
-      <w:r>
-        <w:rPr>
-          <w:rStyle w:val="None"/>
-          <w:rtl w:val="0"/>
-          <w:lang w:val="en-US"/>
-        </w:rPr>
-        <w:t>Perl</w:t>
-      </w:r>
-      <w:r>
-        <w:rPr>
-          <w:rStyle w:val="None"/>
-          <w:rtl w:val="0"/>
-          <w:lang w:val="en-US"/>
-        </w:rPr>
-        <w:t>, Bash</w:t>
+        <w:t>Languages: Python, Ruby, Perl, Bash</w:t>
       </w:r>
     </w:p>
     <w:p>
@@ -1243,15 +1211,7 @@
           <w:rtl w:val="0"/>
           <w:lang w:val="en-US"/>
         </w:rPr>
-        <w:t>Tools: Git (Bitbucket), Jira, Confluence, Swagger/OpenAPI, Docker, Cursor</w:t>
-      </w:r>
-      <w:r>
-        <w:rPr>
-          <w:rStyle w:val="None"/>
-          <w:rtl w:val="0"/>
-          <w:lang w:val="en-US"/>
-        </w:rPr>
-        <w:t>, Notion, n8n</w:t>
+        <w:t>Tools: Git (Bitbucket), Jira, Confluence, Swagger/OpenAPI, Docker, Cursor, Notion, n8n</w:t>
       </w:r>
     </w:p>
     <w:p>
@@ -1291,14 +1251,6 @@
           <w:lang w:val="de-DE"/>
         </w:rPr>
         <w:t>Tulane University</w:t>
-      </w:r>
-      <w:r>
-        <w:rPr>
-          <w:rStyle w:val="None"/>
-          <w:rtl w:val="0"/>
-          <w:lang w:val="en-US"/>
-        </w:rPr>
-        <w:t xml:space="preserve"> - 1998</w:t>
       </w:r>
     </w:p>
     <w:p>

</xml_diff>

<commit_message>
add github url to resume
</commit_message>
<xml_diff>
--- a/public/docs/reidcollins.docx
+++ b/public/docs/reidcollins.docx
@@ -22,6 +22,10 @@
       <w:pPr>
         <w:pStyle w:val="Body A"/>
         <w:spacing w:after="0"/>
+        <w:rPr>
+          <w:rStyle w:val="None"/>
+          <w:lang w:val="en-US"/>
+        </w:rPr>
       </w:pPr>
       <w:r>
         <w:rPr>
@@ -96,14 +100,12 @@
         <w:rPr/>
         <w:fldChar w:fldCharType="end" w:fldLock="0"/>
       </w:r>
-      <w:r>
-        <w:rPr>
-          <w:rStyle w:val="None"/>
-          <w:rtl w:val="0"/>
-          <w:lang w:val="en-US"/>
-        </w:rPr>
-        <w:t xml:space="preserve"> | </w:t>
-      </w:r>
+    </w:p>
+    <w:p>
+      <w:pPr>
+        <w:pStyle w:val="Body A"/>
+        <w:spacing w:after="0"/>
+      </w:pPr>
       <w:r>
         <w:rPr>
           <w:rStyle w:val="Hyperlink.1"/>
@@ -164,6 +166,43 @@
           </w14:textFill>
         </w:rPr>
         <w:t>linkedin.com/in/reidcollins</w:t>
+      </w:r>
+      <w:r>
+        <w:rPr/>
+        <w:fldChar w:fldCharType="end" w:fldLock="0"/>
+      </w:r>
+      <w:r>
+        <w:rPr>
+          <w:rtl w:val="0"/>
+          <w:lang w:val="en-US"/>
+        </w:rPr>
+        <w:t xml:space="preserve"> | </w:t>
+      </w:r>
+      <w:r>
+        <w:rPr>
+          <w:rStyle w:val="Hyperlink.2"/>
+        </w:rPr>
+        <w:fldChar w:fldCharType="begin" w:fldLock="0"/>
+      </w:r>
+      <w:r>
+        <w:rPr>
+          <w:rStyle w:val="Hyperlink.2"/>
+        </w:rPr>
+        <w:instrText xml:space="preserve"> HYPERLINK "https://github.com/snacksnack"</w:instrText>
+      </w:r>
+      <w:r>
+        <w:rPr>
+          <w:rStyle w:val="Hyperlink.2"/>
+        </w:rPr>
+        <w:fldChar w:fldCharType="separate" w:fldLock="0"/>
+      </w:r>
+      <w:r>
+        <w:rPr>
+          <w:rStyle w:val="Hyperlink.2"/>
+          <w:rtl w:val="0"/>
+          <w:lang w:val="en-US"/>
+        </w:rPr>
+        <w:t>github.com/snacksnack</w:t>
       </w:r>
       <w:r>
         <w:rPr/>
@@ -1856,6 +1895,21 @@
       <w:color w:val="0000ff"/>
       <w:u w:val="single" w:color="0000ff"/>
       <w:lang w:val="nl-NL"/>
+      <w14:textFill>
+        <w14:solidFill>
+          <w14:srgbClr w14:val="0000FF"/>
+        </w14:solidFill>
+      </w14:textFill>
+    </w:rPr>
+  </w:style>
+  <w:style w:type="character" w:styleId="Hyperlink.2">
+    <w:name w:val="Hyperlink.2"/>
+    <w:basedOn w:val="Hyperlink"/>
+    <w:next w:val="Hyperlink.2"/>
+    <w:rPr>
+      <w:outline w:val="0"/>
+      <w:color w:val="0000ff"/>
+      <w:u w:val="single" w:color="0000ff"/>
       <w14:textFill>
         <w14:solidFill>
           <w14:srgbClr w14:val="0000FF"/>

</xml_diff>

<commit_message>
add a general bullet point back into resume
</commit_message>
<xml_diff>
--- a/public/docs/reidcollins.docx
+++ b/public/docs/reidcollins.docx
@@ -37,17 +37,7 @@
           <w:rStyle w:val="Hyperlink.0"/>
         </w:rPr>
         <w:fldChar w:fldCharType="begin" w:fldLock="0"/>
-      </w:r>
-      <w:r>
-        <w:rPr>
-          <w:rStyle w:val="Hyperlink.0"/>
-        </w:rPr>
         <w:instrText xml:space="preserve"> HYPERLINK "https://www.hihelloreid.com/"</w:instrText>
-      </w:r>
-      <w:r>
-        <w:rPr>
-          <w:rStyle w:val="Hyperlink.0"/>
-        </w:rPr>
         <w:fldChar w:fldCharType="separate" w:fldLock="0"/>
       </w:r>
       <w:r>
@@ -72,17 +62,7 @@
           <w:rStyle w:val="Hyperlink.0"/>
         </w:rPr>
         <w:fldChar w:fldCharType="begin" w:fldLock="0"/>
-      </w:r>
-      <w:r>
-        <w:rPr>
-          <w:rStyle w:val="Hyperlink.0"/>
-        </w:rPr>
         <w:instrText xml:space="preserve"> HYPERLINK "https://linkedin.com/in/reidcollins"</w:instrText>
-      </w:r>
-      <w:r>
-        <w:rPr>
-          <w:rStyle w:val="Hyperlink.0"/>
-        </w:rPr>
         <w:fldChar w:fldCharType="separate" w:fldLock="0"/>
       </w:r>
       <w:r>
@@ -111,17 +91,7 @@
           <w:rStyle w:val="Hyperlink.0"/>
         </w:rPr>
         <w:fldChar w:fldCharType="begin" w:fldLock="0"/>
-      </w:r>
-      <w:r>
-        <w:rPr>
-          <w:rStyle w:val="Hyperlink.0"/>
-        </w:rPr>
         <w:instrText xml:space="preserve"> HYPERLINK "https://github.com/snacksnack"</w:instrText>
-      </w:r>
-      <w:r>
-        <w:rPr>
-          <w:rStyle w:val="Hyperlink.0"/>
-        </w:rPr>
         <w:fldChar w:fldCharType="separate" w:fldLock="0"/>
       </w:r>
       <w:r>
@@ -260,15 +230,7 @@
           <w:szCs w:val="21"/>
           <w:rtl w:val="0"/>
         </w:rPr>
-        <w:t xml:space="preserve">– </w:t>
-      </w:r>
-      <w:r>
-        <w:rPr>
-          <w:sz w:val="21"/>
-          <w:szCs w:val="21"/>
-          <w:rtl w:val="0"/>
-        </w:rPr>
-        <w:t>2026</w:t>
+        <w:t>– 2026</w:t>
       </w:r>
     </w:p>
     <w:p>
@@ -318,7 +280,7 @@
           <w:rtl w:val="0"/>
           <w:lang w:val="en-US"/>
         </w:rPr>
-        <w:t>Led migration from Phabricator to Bitbucket across engineering, SRE, and client development teams (3 repositories), defining migration strategy, redesigning branching models, enabling automated commits via bot/service accounts, and enforcing mandatory code review on all commits to reduce production issues by 20%</w:t>
+        <w:t>Owned program delivery for a portfolio of platform-migration initiatives, coordinating engineering, SRE, and product teams to land each on schedule and within budget</w:t>
       </w:r>
     </w:p>
     <w:p>
@@ -338,7 +300,7 @@
           <w:rtl w:val="0"/>
           <w:lang w:val="en-US"/>
         </w:rPr>
-        <w:t>Directed migration from on-prem Jira to Jira Cloud across 20 projects and 15 teams, redefining workflows for cloud constraints and incompatible plugins, establishing ticket migration cutoffs, and managing external contractors within budget</w:t>
+        <w:t>Led migration from Phabricator to Bitbucket across engineering, SRE, and client development teams (3 repositories), defining migration strategy, redesigning branching models, enabling automated commits via bot/service accounts, and enforcing mandatory code review on all commits to reduce production issues by 20%</w:t>
       </w:r>
     </w:p>
     <w:p>
@@ -358,22 +320,7 @@
           <w:rtl w:val="0"/>
           <w:lang w:val="en-US"/>
         </w:rPr>
-        <w:t>Established team execution processes and built Jira/Notion/n8n automation workflows for delivery tracking, stakeholder reporting, and stale-ticket visibility, saving ~2 hours per week of manual reporting and cutting stale tickets by a fifth</w:t>
-      </w:r>
-    </w:p>
-    <w:p>
-      <w:pPr>
-        <w:pStyle w:val="Body"/>
-        <w:spacing w:before="80" w:after="30"/>
-      </w:pPr>
-      <w:r>
-        <w:rPr>
-          <w:b w:val="1"/>
-          <w:bCs w:val="1"/>
-          <w:rtl w:val="0"/>
-          <w:lang w:val="en-US"/>
-        </w:rPr>
-        <w:t>Machine Learning / Data Platform</w:t>
+        <w:t>Directed migration from on-prem Jira to Jira Cloud across 20 projects and 15 teams, redefining workflows for cloud constraints and incompatible plugins, establishing ticket migration cutoffs, and managing external contractors within budget</w:t>
       </w:r>
     </w:p>
     <w:p>
@@ -393,21 +340,22 @@
           <w:rtl w:val="0"/>
           <w:lang w:val="en-US"/>
         </w:rPr>
-        <w:t>Led onboarding of 100+ clients to ML platform over two quarters, translating client data requirements into ingestion pipelines using ClickHouse S3 integration and EventBridge to process multi-terabyte datasets (10</w:t>
-      </w:r>
-      <w:r>
-        <w:rPr>
-          <w:rtl w:val="0"/>
-          <w:lang w:val="en-US"/>
-        </w:rPr>
-        <w:t>–</w:t>
-      </w:r>
-      <w:r>
-        <w:rPr>
-          <w:rtl w:val="0"/>
-          <w:lang w:val="en-US"/>
-        </w:rPr>
-        <w:t>50GB per client), reducing average client onboarding time by 30%</w:t>
+        <w:t>Established team execution processes and built Jira/Notion/n8n automation workflows for delivery tracking, stakeholder reporting, and stale-ticket visibility, saving ~2 hours per week of manual reporting and cutting stale tickets by a fifth</w:t>
+      </w:r>
+    </w:p>
+    <w:p>
+      <w:pPr>
+        <w:pStyle w:val="Body"/>
+        <w:spacing w:before="80" w:after="30"/>
+      </w:pPr>
+      <w:r>
+        <w:rPr>
+          <w:b w:val="1"/>
+          <w:bCs w:val="1"/>
+          <w:rtl w:val="0"/>
+          <w:lang w:val="en-US"/>
+        </w:rPr>
+        <w:t>Machine Learning / Data Platform</w:t>
       </w:r>
     </w:p>
     <w:p>
@@ -427,7 +375,7 @@
           <w:rtl w:val="0"/>
           <w:lang w:val="en-US"/>
         </w:rPr>
-        <w:t>Engineered nightly data pipelines with Analytics using Athena and S3, coding ClickHouse queries, implementing client-driven export controls via flag files, enabling cross-team S3 access via AWS SAM, and building monitoring to ensure reliable ingestion</w:t>
+        <w:t>Led onboarding of 100+ clients to ML platform over two quarters, translating client data requirements into ingestion pipelines using ClickHouse S3 integration and EventBridge to process multi-terabyte datasets (10–50GB per client), reducing average client onboarding time by 30%</w:t>
       </w:r>
     </w:p>
     <w:p>
@@ -447,22 +395,7 @@
           <w:rtl w:val="0"/>
           <w:lang w:val="en-US"/>
         </w:rPr>
-        <w:t>Drove cross-functional delivery of Propensity-to-Purchase and Discount Optimization models via a serverless ML platform (Lambda, SQS, EventBridge, SageMaker), coding a data assessment layer shipped to production and coordinating teams to source higher-quality purchase data from distributed systems (ClickHouse, Hive)</w:t>
-      </w:r>
-    </w:p>
-    <w:p>
-      <w:pPr>
-        <w:pStyle w:val="Body"/>
-        <w:spacing w:before="80" w:after="30"/>
-      </w:pPr>
-      <w:r>
-        <w:rPr>
-          <w:b w:val="1"/>
-          <w:bCs w:val="1"/>
-          <w:rtl w:val="0"/>
-          <w:lang w:val="en-US"/>
-        </w:rPr>
-        <w:t>Platform &amp; Backend Systems</w:t>
+        <w:t>Engineered nightly data pipelines with Analytics using Athena and S3, coding ClickHouse queries, implementing client-driven export controls via flag files, enabling cross-team S3 access via AWS SAM, and building monitoring to ensure reliable ingestion</w:t>
       </w:r>
     </w:p>
     <w:p>
@@ -482,21 +415,22 @@
           <w:rtl w:val="0"/>
           <w:lang w:val="en-US"/>
         </w:rPr>
-        <w:t xml:space="preserve">Developed a containerized API proxy and token management system on AWS ECS/Fargate, improving authentication reliability and horizontal scalability </w:t>
-      </w:r>
-      <w:r>
-        <w:rPr>
-          <w:rtl w:val="0"/>
-          <w:lang w:val="en-US"/>
-        </w:rPr>
-        <w:t xml:space="preserve">— </w:t>
-      </w:r>
-      <w:r>
-        <w:rPr>
-          <w:rtl w:val="0"/>
-          <w:lang w:val="en-US"/>
-        </w:rPr>
-        <w:t>sustaining a 400K messages/hour SLA (100K per container across 4 containers)</w:t>
+        <w:t>Drove cross-functional delivery of Propensity-to-Purchase and Discount Optimization models via a serverless ML platform (Lambda, SQS, EventBridge, SageMaker), coding a data assessment layer shipped to production and coordinating teams to source higher-quality purchase data from distributed systems (ClickHouse, Hive)</w:t>
+      </w:r>
+    </w:p>
+    <w:p>
+      <w:pPr>
+        <w:pStyle w:val="Body"/>
+        <w:spacing w:before="80" w:after="30"/>
+      </w:pPr>
+      <w:r>
+        <w:rPr>
+          <w:b w:val="1"/>
+          <w:bCs w:val="1"/>
+          <w:rtl w:val="0"/>
+          <w:lang w:val="en-US"/>
+        </w:rPr>
+        <w:t>Platform &amp; Backend Systems</w:t>
       </w:r>
     </w:p>
     <w:p>
@@ -516,7 +450,7 @@
           <w:rtl w:val="0"/>
           <w:lang w:val="en-US"/>
         </w:rPr>
-        <w:t>Drove zero-downtime migration from Oracle to MySQL, including schema redesign, data migration strategy, and implementing code changes to eliminate legacy database dependencies, eliminating over $100K in annual Oracle licensing and support costs</w:t>
+        <w:t>Developed a containerized API proxy and token management system on AWS ECS/Fargate, improving authentication reliability and horizontal scalability — sustaining a 400K messages/hour SLA (100K per container across 4 containers)</w:t>
       </w:r>
     </w:p>
     <w:p>
@@ -536,7 +470,7 @@
           <w:rtl w:val="0"/>
           <w:lang w:val="en-US"/>
         </w:rPr>
-        <w:t>Coordinated seamless migration of image caching infrastructure from Akamai to Cloudflare across 125 client domains, updating application code and partnering with clients to manage certificate changes with zero service disruption</w:t>
+        <w:t>Drove zero-downtime migration from Oracle to MySQL, including schema redesign, data migration strategy, and implementing code changes to eliminate legacy database dependencies, eliminating over $100K in annual Oracle licensing and support costs</w:t>
       </w:r>
     </w:p>
     <w:p>
@@ -556,7 +490,7 @@
           <w:rtl w:val="0"/>
           <w:lang w:val="en-US"/>
         </w:rPr>
-        <w:t>Developed backend services for authentication, campaign data, service health, and DynamoDB integrations in high-throughput systems</w:t>
+        <w:t>Coordinated seamless migration of image caching infrastructure from Akamai to Cloudflare across 125 client domains, updating application code and partnering with clients to manage certificate changes with zero service disruption</w:t>
       </w:r>
     </w:p>
     <w:p>
@@ -576,22 +510,7 @@
           <w:rtl w:val="0"/>
           <w:lang w:val="en-US"/>
         </w:rPr>
-        <w:t>Defined API contracts using Swagger/OpenAPI to support cross-team and client-facing integrations, improving implementation clarity across engineering, SRE, and partner teams</w:t>
-      </w:r>
-    </w:p>
-    <w:p>
-      <w:pPr>
-        <w:pStyle w:val="Body"/>
-        <w:spacing w:before="80" w:after="30"/>
-      </w:pPr>
-      <w:r>
-        <w:rPr>
-          <w:b w:val="1"/>
-          <w:bCs w:val="1"/>
-          <w:rtl w:val="0"/>
-          <w:lang w:val="en-US"/>
-        </w:rPr>
-        <w:t>Observability &amp; Reliability</w:t>
+        <w:t>Developed backend services for authentication, campaign data, service health, and DynamoDB integrations in high-throughput systems</w:t>
       </w:r>
     </w:p>
     <w:p>
@@ -611,7 +530,22 @@
           <w:rtl w:val="0"/>
           <w:lang w:val="en-US"/>
         </w:rPr>
-        <w:t>Led development of a custom observability framework (structured logging, distributed tracing, Prometheus, Grafana) for high-throughput, time-sensitive systems processing thousands of event-based messages per minute</w:t>
+        <w:t>Defined API contracts using Swagger/OpenAPI to support cross-team and client-facing integrations, improving implementation clarity across engineering, SRE, and partner teams</w:t>
+      </w:r>
+    </w:p>
+    <w:p>
+      <w:pPr>
+        <w:pStyle w:val="Body"/>
+        <w:spacing w:before="80" w:after="30"/>
+      </w:pPr>
+      <w:r>
+        <w:rPr>
+          <w:b w:val="1"/>
+          <w:bCs w:val="1"/>
+          <w:rtl w:val="0"/>
+          <w:lang w:val="en-US"/>
+        </w:rPr>
+        <w:t>Observability &amp; Reliability</w:t>
       </w:r>
     </w:p>
     <w:p>
@@ -631,79 +565,7 @@
           <w:rtl w:val="0"/>
           <w:lang w:val="en-US"/>
         </w:rPr>
-        <w:t xml:space="preserve">Built AI-powered incident summarization system using AWS Lambda, SAM, DynamoDB, Claude, Slack, and Jira to ingest alerts from CloudWatch, Datadog, and GitHub Actions, consolidating repeat alerts from the same failing service into single incidents and generating operational summaries </w:t>
-      </w:r>
-      <w:r>
-        <w:rPr>
-          <w:rtl w:val="0"/>
-          <w:lang w:val="en-US"/>
-        </w:rPr>
-        <w:t xml:space="preserve">— </w:t>
-      </w:r>
-      <w:r>
-        <w:rPr>
-          <w:rtl w:val="0"/>
-          <w:lang w:val="en-US"/>
-        </w:rPr>
-        <w:t>cutting post-mortem turnaround from days to hours</w:t>
-      </w:r>
-    </w:p>
-    <w:p>
-      <w:pPr>
-        <w:pStyle w:val="Body"/>
-        <w:tabs>
-          <w:tab w:val="right" w:pos="10492"/>
-        </w:tabs>
-        <w:spacing w:before="100"/>
-      </w:pPr>
-      <w:r>
-        <w:rPr>
-          <w:b w:val="1"/>
-          <w:bCs w:val="1"/>
-          <w:rtl w:val="0"/>
-        </w:rPr>
-        <w:t>Cheetah Digital</w:t>
-      </w:r>
-      <w:r>
-        <w:rPr>
-          <w:sz w:val="21"/>
-          <w:szCs w:val="21"/>
-          <w:rtl w:val="0"/>
-        </w:rPr>
-        <w:tab/>
-        <w:t xml:space="preserve">2015 </w:t>
-      </w:r>
-      <w:r>
-        <w:rPr>
-          <w:sz w:val="21"/>
-          <w:szCs w:val="21"/>
-          <w:rtl w:val="0"/>
-        </w:rPr>
-        <w:t xml:space="preserve">– </w:t>
-      </w:r>
-      <w:r>
-        <w:rPr>
-          <w:sz w:val="21"/>
-          <w:szCs w:val="21"/>
-          <w:rtl w:val="0"/>
-          <w:lang w:val="en-US"/>
-        </w:rPr>
-        <w:t>2021</w:t>
-      </w:r>
-    </w:p>
-    <w:p>
-      <w:pPr>
-        <w:pStyle w:val="Body"/>
-        <w:spacing w:after="40"/>
-      </w:pPr>
-      <w:r>
-        <w:rPr>
-          <w:i w:val="1"/>
-          <w:iCs w:val="1"/>
-          <w:rtl w:val="0"/>
-          <w:lang w:val="en-US"/>
-        </w:rPr>
-        <w:t>Technical Program Manager / Software Developer</w:t>
+        <w:t>Led development of a custom observability framework (structured logging, distributed tracing, Prometheus, Grafana) for high-throughput, time-sensitive systems processing thousands of event-based messages per minute</w:t>
       </w:r>
     </w:p>
     <w:p>
@@ -723,7 +585,57 @@
           <w:rtl w:val="0"/>
           <w:lang w:val="en-US"/>
         </w:rPr>
-        <w:t>Led Agile delivery processes as Scrum Master across multiple engineering teams, improving planning accuracy and execution consistency</w:t>
+        <w:t>Built AI-powered incident summarization system using AWS Lambda, SAM, DynamoDB, Claude, Slack, and Jira to ingest alerts from CloudWatch, Datadog, and GitHub Actions, consolidating repeat alerts from the same failing service into single incidents and generating operational summaries — cutting post-mortem turnaround from days to hours</w:t>
+      </w:r>
+    </w:p>
+    <w:p>
+      <w:pPr>
+        <w:pStyle w:val="Body"/>
+        <w:tabs>
+          <w:tab w:val="right" w:pos="10492"/>
+        </w:tabs>
+        <w:spacing w:before="100"/>
+      </w:pPr>
+      <w:r>
+        <w:rPr>
+          <w:b w:val="1"/>
+          <w:bCs w:val="1"/>
+          <w:rtl w:val="0"/>
+        </w:rPr>
+        <w:t>Cheetah Digital</w:t>
+      </w:r>
+      <w:r>
+        <w:rPr>
+          <w:sz w:val="21"/>
+          <w:szCs w:val="21"/>
+          <w:rtl w:val="0"/>
+        </w:rPr>
+        <w:tab/>
+        <w:t xml:space="preserve">2015 – </w:t>
+      </w:r>
+      <w:r>
+        <w:rPr>
+          <w:sz w:val="21"/>
+          <w:szCs w:val="21"/>
+          <w:rtl w:val="0"/>
+          <w:lang w:val="en-US"/>
+        </w:rPr>
+        <w:t>2021</w:t>
+      </w:r>
+    </w:p>
+    <w:p>
+      <w:pPr>
+        <w:pStyle w:val="Body"/>
+        <w:spacing w:after="40"/>
+      </w:pPr>
+      <w:r>
+        <w:rPr>
+          <w:i w:val="1"/>
+          <w:iCs w:val="1"/>
+          <w:rtl w:val="0"/>
+          <w:lang w:val="en-US"/>
+        </w:rPr>
+        <w:t>Technical Program Manager / Software Developer</w:t>
       </w:r>
     </w:p>
     <w:p>
@@ -743,7 +655,7 @@
           <w:rtl w:val="0"/>
           <w:lang w:val="en-US"/>
         </w:rPr>
-        <w:t>Built backend services and data-processing systems supporting high-volume client workloads</w:t>
+        <w:t>Led Agile delivery processes as Scrum Master across multiple engineering teams, improving planning accuracy and execution consistency</w:t>
       </w:r>
     </w:p>
     <w:p>
@@ -763,6 +675,26 @@
           <w:rtl w:val="0"/>
           <w:lang w:val="en-US"/>
         </w:rPr>
+        <w:t>Built backend services and data-processing systems supporting high-volume client workloads</w:t>
+      </w:r>
+    </w:p>
+    <w:p>
+      <w:pPr>
+        <w:pStyle w:val="List Paragraph"/>
+        <w:numPr>
+          <w:ilvl w:val="0"/>
+          <w:numId w:val="2"/>
+        </w:numPr>
+        <w:spacing w:after="40" w:line="252" w:lineRule="auto"/>
+        <w:rPr>
+          <w:lang w:val="en-US"/>
+        </w:rPr>
+      </w:pPr>
+      <w:r>
+        <w:rPr>
+          <w:rtl w:val="0"/>
+          <w:lang w:val="en-US"/>
+        </w:rPr>
         <w:t>Partnered directly with enterprise clients to scope integrations, troubleshoot data and workflow issues, and translate client requirements into backend delivery plans</w:t>
       </w:r>
     </w:p>
@@ -790,23 +722,7 @@
           <w:rtl w:val="0"/>
         </w:rPr>
         <w:tab/>
-        <w:t xml:space="preserve">2008 </w:t>
-      </w:r>
-      <w:r>
-        <w:rPr>
-          <w:sz w:val="21"/>
-          <w:szCs w:val="21"/>
-          <w:rtl w:val="0"/>
-        </w:rPr>
-        <w:t xml:space="preserve">– </w:t>
-      </w:r>
-      <w:r>
-        <w:rPr>
-          <w:sz w:val="21"/>
-          <w:szCs w:val="21"/>
-          <w:rtl w:val="0"/>
-        </w:rPr>
-        <w:t>2015</w:t>
+        <w:t>2008 – 2015</w:t>
       </w:r>
     </w:p>
     <w:p>
@@ -1070,14 +986,7 @@
           <w:rtl w:val="0"/>
           <w:lang w:val="en-US"/>
         </w:rPr>
-        <w:t xml:space="preserve">Bachelor of Arts, International Relations </w:t>
-      </w:r>
-      <w:r>
-        <w:rPr>
-          <w:rtl w:val="0"/>
-          <w:lang w:val="en-US"/>
-        </w:rPr>
-        <w:t xml:space="preserve">— </w:t>
+        <w:t xml:space="preserve">Bachelor of Arts, International Relations — </w:t>
       </w:r>
       <w:r>
         <w:rPr>
@@ -1498,7 +1407,7 @@
           <w:bar w:val="nil"/>
         </w:pBdr>
         <w:shd w:val="clear" w:color="auto" w:fill="auto"/>
-        <w:suppressAutoHyphens w:val="0"/>
+        <w:suppressAutoHyphens w:val="1"/>
         <w:spacing w:before="0" w:beforeAutospacing="0" w:after="0" w:afterAutospacing="0" w:line="240" w:lineRule="auto"/>
         <w:ind w:left="0" w:right="0" w:firstLine="0"/>
         <w:jc w:val="left"/>
@@ -1565,7 +1474,7 @@
       <w:tabs>
         <w:tab w:val="right" w:pos="9020"/>
       </w:tabs>
-      <w:suppressAutoHyphens w:val="0"/>
+      <w:suppressAutoHyphens w:val="1"/>
       <w:bidi w:val="0"/>
       <w:spacing w:before="0" w:after="0" w:line="240" w:lineRule="auto"/>
       <w:ind w:left="0" w:right="0" w:firstLine="0"/>
@@ -1611,7 +1520,7 @@
       <w:pageBreakBefore w:val="0"/>
       <w:widowControl w:val="1"/>
       <w:shd w:val="clear" w:color="auto" w:fill="auto"/>
-      <w:suppressAutoHyphens w:val="0"/>
+      <w:suppressAutoHyphens w:val="1"/>
       <w:bidi w:val="0"/>
       <w:spacing w:before="0" w:after="0" w:line="240" w:lineRule="auto"/>
       <w:ind w:left="0" w:right="0" w:firstLine="0"/>
@@ -1680,7 +1589,7 @@
       <w:pageBreakBefore w:val="0"/>
       <w:widowControl w:val="1"/>
       <w:shd w:val="clear" w:color="auto" w:fill="auto"/>
-      <w:suppressAutoHyphens w:val="0"/>
+      <w:suppressAutoHyphens w:val="1"/>
       <w:bidi w:val="0"/>
       <w:spacing w:before="0" w:after="0" w:line="240" w:lineRule="auto"/>
       <w:ind w:left="0" w:right="0" w:firstLine="0"/>

</xml_diff>

<commit_message>
add more TPM signaling to the resume
</commit_message>
<xml_diff>
--- a/public/docs/reidcollins.docx
+++ b/public/docs/reidcollins.docx
@@ -340,7 +340,7 @@
           <w:rtl w:val="0"/>
           <w:lang w:val="en-US"/>
         </w:rPr>
-        <w:t>Established team execution processes and built Jira/Notion/n8n automation workflows for delivery tracking, stakeholder reporting, and stale-ticket visibility, saving ~2 hours per week of manual reporting and cutting stale tickets by a fifth</w:t>
+        <w:t>Led program governance — roadmap execution, release planning, decision &amp; RAID logs, and dependency tracking — while building Jira/Notion/n8n automation that cut manual reporting ~2 hrs/week and stale tickets 20%</w:t>
       </w:r>
     </w:p>
     <w:p>
@@ -375,7 +375,7 @@
           <w:rtl w:val="0"/>
           <w:lang w:val="en-US"/>
         </w:rPr>
-        <w:t>Led onboarding of 100+ clients to ML platform over two quarters, translating client data requirements into ingestion pipelines using ClickHouse S3 integration and EventBridge to process multi-terabyte datasets (10–50GB per client), reducing average client onboarding time by 30%</w:t>
+        <w:t>Led onboarding of 100+ clients to the ML platform over two quarters, translating client data requirements into ClickHouse-to-S3 + EventBridge ingestion for multi-terabyte datasets (10–50GB per client) and coordinating cross-account, multi-region (US/APAC/Japan) access — cutting average onboarding time by 30%</w:t>
       </w:r>
     </w:p>
     <w:p>
@@ -395,7 +395,7 @@
           <w:rtl w:val="0"/>
           <w:lang w:val="en-US"/>
         </w:rPr>
-        <w:t>Engineered nightly data pipelines with Analytics using Athena and S3, coding ClickHouse queries, implementing client-driven export controls via flag files, enabling cross-team S3 access via AWS SAM, and building monitoring to ensure reliable ingestion</w:t>
+        <w:t>Engineered nightly data pipelines on Athena and S3, coding ClickHouse queries with client-driven export controls and cross-team S3 access via AWS SAM, plus monitoring to ensure reliable ingestion</w:t>
       </w:r>
     </w:p>
     <w:p>
@@ -415,22 +415,7 @@
           <w:rtl w:val="0"/>
           <w:lang w:val="en-US"/>
         </w:rPr>
-        <w:t>Drove cross-functional delivery of Propensity-to-Purchase and Discount Optimization models via a serverless ML platform (Lambda, SQS, EventBridge, SageMaker), coding a data assessment layer shipped to production and coordinating teams to source higher-quality purchase data from distributed systems (ClickHouse, Hive)</w:t>
-      </w:r>
-    </w:p>
-    <w:p>
-      <w:pPr>
-        <w:pStyle w:val="Body"/>
-        <w:spacing w:before="80" w:after="30"/>
-      </w:pPr>
-      <w:r>
-        <w:rPr>
-          <w:b w:val="1"/>
-          <w:bCs w:val="1"/>
-          <w:rtl w:val="0"/>
-          <w:lang w:val="en-US"/>
-        </w:rPr>
-        <w:t>Platform &amp; Backend Systems</w:t>
+        <w:t>Drove release delivery of three production ML models — Propensity-to-Purchase, Discount Optimization, and Send Time Optimization — on a serverless platform (Lambda, SQS, EventBridge, SageMaker), owning release planning, deployment readiness, and cross-functional dependencies through production launch</w:t>
       </w:r>
     </w:p>
     <w:p>
@@ -450,7 +435,7 @@
           <w:rtl w:val="0"/>
           <w:lang w:val="en-US"/>
         </w:rPr>
-        <w:t>Developed a containerized API proxy and token management system on AWS ECS/Fargate, improving authentication reliability and horizontal scalability — sustaining a 400K messages/hour SLA (100K per container across 4 containers)</w:t>
+        <w:t>Delivered a queue-driven (SQS) export pipeline on a scheduled cadence to return model scores to clients, safely handling concurrent multi-exports</w:t>
       </w:r>
     </w:p>
     <w:p>
@@ -470,7 +455,22 @@
           <w:rtl w:val="0"/>
           <w:lang w:val="en-US"/>
         </w:rPr>
-        <w:t>Drove zero-downtime migration from Oracle to MySQL, including schema redesign, data migration strategy, and implementing code changes to eliminate legacy database dependencies, eliminating over $100K in annual Oracle licensing and support costs</w:t>
+        <w:t>Shipped a run-tracking service (Lambda + DynamoDB) storing training/scoring runs by month with a query API, giving teams operational visibility into model-run history</w:t>
+      </w:r>
+    </w:p>
+    <w:p>
+      <w:pPr>
+        <w:pStyle w:val="Body"/>
+        <w:spacing w:before="80" w:after="30"/>
+      </w:pPr>
+      <w:r>
+        <w:rPr>
+          <w:b w:val="1"/>
+          <w:bCs w:val="1"/>
+          <w:rtl w:val="0"/>
+          <w:lang w:val="en-US"/>
+        </w:rPr>
+        <w:t>Platform &amp; Backend Systems</w:t>
       </w:r>
     </w:p>
     <w:p>
@@ -490,7 +490,7 @@
           <w:rtl w:val="0"/>
           <w:lang w:val="en-US"/>
         </w:rPr>
-        <w:t>Coordinated seamless migration of image caching infrastructure from Akamai to Cloudflare across 125 client domains, updating application code and partnering with clients to manage certificate changes with zero service disruption</w:t>
+        <w:t>Developed a containerized API proxy and token management system on AWS ECS/Fargate, improving authentication reliability and horizontal scalability — sustaining a 400K messages/hour SLA (100K per container across 4 containers)</w:t>
       </w:r>
     </w:p>
     <w:p>
@@ -510,7 +510,7 @@
           <w:rtl w:val="0"/>
           <w:lang w:val="en-US"/>
         </w:rPr>
-        <w:t>Developed backend services for authentication, campaign data, service health, and DynamoDB integrations in high-throughput systems</w:t>
+        <w:t>Drove zero-downtime migration from Oracle to MySQL, including schema redesign, data migration strategy, and implementing code changes to eliminate legacy database dependencies, eliminating over $100K in annual Oracle licensing and support costs</w:t>
       </w:r>
     </w:p>
     <w:p>
@@ -530,22 +530,7 @@
           <w:rtl w:val="0"/>
           <w:lang w:val="en-US"/>
         </w:rPr>
-        <w:t>Defined API contracts using Swagger/OpenAPI to support cross-team and client-facing integrations, improving implementation clarity across engineering, SRE, and partner teams</w:t>
-      </w:r>
-    </w:p>
-    <w:p>
-      <w:pPr>
-        <w:pStyle w:val="Body"/>
-        <w:spacing w:before="80" w:after="30"/>
-      </w:pPr>
-      <w:r>
-        <w:rPr>
-          <w:b w:val="1"/>
-          <w:bCs w:val="1"/>
-          <w:rtl w:val="0"/>
-          <w:lang w:val="en-US"/>
-        </w:rPr>
-        <w:t>Observability &amp; Reliability</w:t>
+        <w:t>Coordinated seamless migration of image caching infrastructure from Akamai to Cloudflare across 125 client domains, updating application code and partnering with clients to manage certificate changes with zero service disruption</w:t>
       </w:r>
     </w:p>
     <w:p>
@@ -565,7 +550,7 @@
           <w:rtl w:val="0"/>
           <w:lang w:val="en-US"/>
         </w:rPr>
-        <w:t>Led development of a custom observability framework (structured logging, distributed tracing, Prometheus, Grafana) for high-throughput, time-sensitive systems processing thousands of event-based messages per minute</w:t>
+        <w:t>Developed backend services for authentication, campaign data, service health, and DynamoDB integrations in high-throughput systems</w:t>
       </w:r>
     </w:p>
     <w:p>
@@ -585,57 +570,22 @@
           <w:rtl w:val="0"/>
           <w:lang w:val="en-US"/>
         </w:rPr>
-        <w:t>Built AI-powered incident summarization system using AWS Lambda, SAM, DynamoDB, Claude, Slack, and Jira to ingest alerts from CloudWatch, Datadog, and GitHub Actions, consolidating repeat alerts from the same failing service into single incidents and generating operational summaries — cutting post-mortem turnaround from days to hours</w:t>
+        <w:t>Defined API contracts using Swagger/OpenAPI to support cross-team and client-facing integrations, improving implementation clarity across engineering, SRE, and partner teams</w:t>
       </w:r>
     </w:p>
     <w:p>
       <w:pPr>
         <w:pStyle w:val="Body"/>
-        <w:tabs>
-          <w:tab w:val="right" w:pos="10492"/>
-        </w:tabs>
-        <w:spacing w:before="100"/>
+        <w:spacing w:before="80" w:after="30"/>
       </w:pPr>
       <w:r>
         <w:rPr>
           <w:b w:val="1"/>
           <w:bCs w:val="1"/>
           <w:rtl w:val="0"/>
-        </w:rPr>
-        <w:t>Cheetah Digital</w:t>
-      </w:r>
-      <w:r>
-        <w:rPr>
-          <w:sz w:val="21"/>
-          <w:szCs w:val="21"/>
-          <w:rtl w:val="0"/>
-        </w:rPr>
-        <w:tab/>
-        <w:t xml:space="preserve">2015 – </w:t>
-      </w:r>
-      <w:r>
-        <w:rPr>
-          <w:sz w:val="21"/>
-          <w:szCs w:val="21"/>
-          <w:rtl w:val="0"/>
-          <w:lang w:val="en-US"/>
-        </w:rPr>
-        <w:t>2021</w:t>
-      </w:r>
-    </w:p>
-    <w:p>
-      <w:pPr>
-        <w:pStyle w:val="Body"/>
-        <w:spacing w:after="40"/>
-      </w:pPr>
-      <w:r>
-        <w:rPr>
-          <w:i w:val="1"/>
-          <w:iCs w:val="1"/>
-          <w:rtl w:val="0"/>
-          <w:lang w:val="en-US"/>
-        </w:rPr>
-        <w:t>Technical Program Manager / Software Developer</w:t>
+          <w:lang w:val="en-US"/>
+        </w:rPr>
+        <w:t>Observability &amp; Reliability</w:t>
       </w:r>
     </w:p>
     <w:p>
@@ -655,7 +605,7 @@
           <w:rtl w:val="0"/>
           <w:lang w:val="en-US"/>
         </w:rPr>
-        <w:t>Led Agile delivery processes as Scrum Master across multiple engineering teams, improving planning accuracy and execution consistency</w:t>
+        <w:t>Led development of a custom observability framework (structured logging, distributed tracing, Prometheus, Grafana) for high-throughput, time-sensitive systems processing thousands of event-based messages per minute</w:t>
       </w:r>
     </w:p>
     <w:p>
@@ -675,7 +625,57 @@
           <w:rtl w:val="0"/>
           <w:lang w:val="en-US"/>
         </w:rPr>
-        <w:t>Built backend services and data-processing systems supporting high-volume client workloads</w:t>
+        <w:t>Built AI-powered incident summarization system using AWS Lambda, SAM, DynamoDB, Claude, Slack, and Jira to ingest alerts from CloudWatch, Datadog, and GitHub Actions, consolidating repeat alerts from the same failing service into single incidents and generating operational summaries — cutting post-mortem turnaround from days to hours</w:t>
+      </w:r>
+    </w:p>
+    <w:p>
+      <w:pPr>
+        <w:pStyle w:val="Body"/>
+        <w:tabs>
+          <w:tab w:val="right" w:pos="10492"/>
+        </w:tabs>
+        <w:spacing w:before="100"/>
+      </w:pPr>
+      <w:r>
+        <w:rPr>
+          <w:b w:val="1"/>
+          <w:bCs w:val="1"/>
+          <w:rtl w:val="0"/>
+        </w:rPr>
+        <w:t>Cheetah Digital</w:t>
+      </w:r>
+      <w:r>
+        <w:rPr>
+          <w:sz w:val="21"/>
+          <w:szCs w:val="21"/>
+          <w:rtl w:val="0"/>
+        </w:rPr>
+        <w:tab/>
+        <w:t xml:space="preserve">2015 – </w:t>
+      </w:r>
+      <w:r>
+        <w:rPr>
+          <w:sz w:val="21"/>
+          <w:szCs w:val="21"/>
+          <w:rtl w:val="0"/>
+          <w:lang w:val="en-US"/>
+        </w:rPr>
+        <w:t>2021</w:t>
+      </w:r>
+    </w:p>
+    <w:p>
+      <w:pPr>
+        <w:pStyle w:val="Body"/>
+        <w:spacing w:after="40"/>
+      </w:pPr>
+      <w:r>
+        <w:rPr>
+          <w:i w:val="1"/>
+          <w:iCs w:val="1"/>
+          <w:rtl w:val="0"/>
+          <w:lang w:val="en-US"/>
+        </w:rPr>
+        <w:t>Technical Program Manager / Software Developer</w:t>
       </w:r>
     </w:p>
     <w:p>
@@ -695,6 +695,46 @@
           <w:rtl w:val="0"/>
           <w:lang w:val="en-US"/>
         </w:rPr>
+        <w:t>Led Agile delivery processes as Scrum Master across multiple engineering teams, improving planning accuracy and execution consistency</w:t>
+      </w:r>
+    </w:p>
+    <w:p>
+      <w:pPr>
+        <w:pStyle w:val="List Paragraph"/>
+        <w:numPr>
+          <w:ilvl w:val="0"/>
+          <w:numId w:val="2"/>
+        </w:numPr>
+        <w:spacing w:after="40" w:line="252" w:lineRule="auto"/>
+        <w:rPr>
+          <w:lang w:val="en-US"/>
+        </w:rPr>
+      </w:pPr>
+      <w:r>
+        <w:rPr>
+          <w:rtl w:val="0"/>
+          <w:lang w:val="en-US"/>
+        </w:rPr>
+        <w:t>Built backend services and data-processing systems supporting high-volume client workloads</w:t>
+      </w:r>
+    </w:p>
+    <w:p>
+      <w:pPr>
+        <w:pStyle w:val="List Paragraph"/>
+        <w:numPr>
+          <w:ilvl w:val="0"/>
+          <w:numId w:val="2"/>
+        </w:numPr>
+        <w:spacing w:after="40" w:line="252" w:lineRule="auto"/>
+        <w:rPr>
+          <w:lang w:val="en-US"/>
+        </w:rPr>
+      </w:pPr>
+      <w:r>
+        <w:rPr>
+          <w:rtl w:val="0"/>
+          <w:lang w:val="en-US"/>
+        </w:rPr>
         <w:t>Partnered directly with enterprise clients to scope integrations, troubleshoot data and workflow issues, and translate client requirements into backend delivery plans</w:t>
       </w:r>
     </w:p>
@@ -737,7 +777,7 @@
           <w:rtl w:val="0"/>
           <w:lang w:val="en-US"/>
         </w:rPr>
-        <w:t>Software Developer / Client Solutions Team</w:t>
+        <w:t>Solutions Developer / Client Solutions Team</w:t>
       </w:r>
     </w:p>
     <w:p>
@@ -864,14 +904,14 @@
           <w:rtl w:val="0"/>
           <w:lang w:val="en-US"/>
         </w:rPr>
-        <w:t xml:space="preserve">Languages: </w:t>
-      </w:r>
-      <w:r>
-        <w:rPr>
-          <w:rtl w:val="0"/>
-          <w:lang w:val="en-US"/>
-        </w:rPr>
-        <w:t>Python, Ruby, Perl, Bash</w:t>
+        <w:t xml:space="preserve">Program Management:</w:t>
+      </w:r>
+      <w:r>
+        <w:rPr>
+          <w:rtl w:val="0"/>
+          <w:lang w:val="en-US"/>
+        </w:rPr>
+        <w:t xml:space="preserve"> Agile, Scrum, Program Governance, Roadmap Execution, Release Planning, Release Management, RAID Management, Dependency Management, Stakeholder Management, Jira, Confluence, Notion, n8n</w:t>
       </w:r>
     </w:p>
     <w:p>
@@ -884,15 +924,16 @@
           <w:b w:val="1"/>
           <w:bCs w:val="1"/>
           <w:rtl w:val="0"/>
-        </w:rPr>
-        <w:t xml:space="preserve">AWS: </w:t>
-      </w:r>
-      <w:r>
-        <w:rPr>
-          <w:rtl w:val="0"/>
-          <w:lang w:val="en-US"/>
-        </w:rPr>
-        <w:t>ECS/Fargate, Lambda, SQS, EventBridge, SageMaker, S3, Athena</w:t>
+          <w:lang w:val="en-US"/>
+        </w:rPr>
+        <w:t xml:space="preserve">Languages:</w:t>
+      </w:r>
+      <w:r>
+        <w:rPr>
+          <w:rtl w:val="0"/>
+          <w:lang w:val="en-US"/>
+        </w:rPr>
+        <w:t xml:space="preserve"> Python, Perl, Ruby, Bash</w:t>
       </w:r>
     </w:p>
     <w:p>
@@ -905,16 +946,14 @@
           <w:b w:val="1"/>
           <w:bCs w:val="1"/>
           <w:rtl w:val="0"/>
-          <w:lang w:val="it-IT"/>
-        </w:rPr>
-        <w:t xml:space="preserve">Data: </w:t>
-      </w:r>
-      <w:r>
-        <w:rPr>
-          <w:rtl w:val="0"/>
-          <w:lang w:val="en-US"/>
-        </w:rPr>
-        <w:t>MySQL, PostgreSQL, ClickHouse, Hive, DynamoDB</w:t>
+        </w:rPr>
+        <w:t xml:space="preserve">Cloud &amp; Infrastructure:</w:t>
+      </w:r>
+      <w:r>
+        <w:rPr>
+          <w:rtl w:val="0"/>
+        </w:rPr>
+        <w:t xml:space="preserve"> AWS (ECS/Fargate, Lambda, SQS, EventBridge, SageMaker, S3, Athena, AWS SAM)</w:t>
       </w:r>
     </w:p>
     <w:p>
@@ -927,16 +966,16 @@
           <w:b w:val="1"/>
           <w:bCs w:val="1"/>
           <w:rtl w:val="0"/>
-          <w:lang w:val="en-US"/>
-        </w:rPr>
-        <w:t xml:space="preserve">Observability: </w:t>
-      </w:r>
-      <w:r>
-        <w:rPr>
-          <w:rtl w:val="0"/>
-          <w:lang w:val="en-US"/>
-        </w:rPr>
-        <w:t>Prometheus, Grafana, distributed tracing, structured logging</w:t>
+          <w:lang w:val="it-IT"/>
+        </w:rPr>
+        <w:t xml:space="preserve">Data:</w:t>
+      </w:r>
+      <w:r>
+        <w:rPr>
+          <w:rtl w:val="0"/>
+          <w:lang w:val="it-IT"/>
+        </w:rPr>
+        <w:t xml:space="preserve"> MySQL, PostgreSQL, ClickHouse, Hive, DynamoDB</w:t>
       </w:r>
     </w:p>
     <w:p>
@@ -951,14 +990,14 @@
           <w:rtl w:val="0"/>
           <w:lang w:val="en-US"/>
         </w:rPr>
-        <w:t xml:space="preserve">Tools: </w:t>
-      </w:r>
-      <w:r>
-        <w:rPr>
-          <w:rtl w:val="0"/>
-          <w:lang w:val="en-US"/>
-        </w:rPr>
-        <w:t>Git (Bitbucket, Github), Jira, Confluence, Swagger/OpenAPI, Docker, Cursor, Notion, n8n</w:t>
+        <w:t xml:space="preserve">Observability:</w:t>
+      </w:r>
+      <w:r>
+        <w:rPr>
+          <w:rtl w:val="0"/>
+          <w:lang w:val="en-US"/>
+        </w:rPr>
+        <w:t xml:space="preserve"> Prometheus, Grafana, distributed tracing, structured logging</w:t>
       </w:r>
     </w:p>
     <w:p>
@@ -966,12 +1005,34 @@
         <w:pStyle w:val="Body"/>
         <w:spacing w:after="20"/>
       </w:pPr>
+      <w:r>
+        <w:rPr>
+          <w:b w:val="1"/>
+          <w:bCs w:val="1"/>
+          <w:rtl w:val="0"/>
+          <w:lang w:val="en-US"/>
+        </w:rPr>
+        <w:t xml:space="preserve">Developer Tools:</w:t>
+      </w:r>
+      <w:r>
+        <w:rPr>
+          <w:rtl w:val="0"/>
+          <w:lang w:val="en-US"/>
+        </w:rPr>
+        <w:t xml:space="preserve"> Git (GitHub, Bitbucket), Docker, Swagger/OpenAPI, Cursor</w:t>
+      </w:r>
     </w:p>
     <w:p>
       <w:pPr>
         <w:pStyle w:val="Body"/>
         <w:spacing w:after="20"/>
       </w:pPr>
+    </w:p>
+    <w:p>
+      <w:pPr>
+        <w:pStyle w:val="Body"/>
+        <w:spacing w:after="20"/>
+      </w:pPr>
       <w:r>
         <w:rPr>
           <w:b w:val="1"/>
@@ -979,7 +1040,14 @@
           <w:rtl w:val="0"/>
           <w:lang w:val="en-US"/>
         </w:rPr>
-        <w:t xml:space="preserve">Education: </w:t>
+        <w:t xml:space="preserve">Education:</w:t>
+      </w:r>
+      <w:r>
+        <w:rPr>
+          <w:rtl w:val="0"/>
+          <w:lang w:val="en-US"/>
+        </w:rPr>
+        <w:t xml:space="preserve"> </w:t>
       </w:r>
       <w:r>
         <w:rPr>
@@ -1008,7 +1076,14 @@
           <w:rtl w:val="0"/>
           <w:lang w:val="fr-FR"/>
         </w:rPr>
-        <w:t xml:space="preserve">Certifications: </w:t>
+        <w:t xml:space="preserve">Certifications:</w:t>
+      </w:r>
+      <w:r>
+        <w:rPr>
+          <w:rtl w:val="0"/>
+          <w:lang w:val="fr-FR"/>
+        </w:rPr>
+        <w:t xml:space="preserve"> </w:t>
       </w:r>
       <w:r>
         <w:rPr>

</xml_diff>

<commit_message>
RC1-410: an AI & Agents skills row, and a summary that says so
The resume linked to nine live agent systems and named none of them.
Adds the skills row, rewrites the summary to lead with the current work,
and moves Jira/Confluence/Notion/n8n into Developer Tools so the PDF and
the site agree. Still two pages.
</commit_message>
<xml_diff>
--- a/public/docs/reidcollins.docx
+++ b/public/docs/reidcollins.docx
@@ -162,7 +162,7 @@
           <w:rtl w:val="0"/>
           <w:lang w:val="en-US"/>
         </w:rPr>
-        <w:t>Senior Technical Program Manager / Software Developer with a hybrid background in software engineering, program leadership, and client-facing technical delivery. Proven track record of driving large-scale platform migrations, leading cross-functional initiatives, translating business requirements into production systems, and delivering scalable solutions on AWS.</w:t>
+        <w:t>Senior Technical Program Manager / Software Developer building AI agents and workflow automation, on a hybrid background in software engineering, program leadership, and client-facing technical delivery. Track record spans large-scale platform migrations, ML platform delivery, and cross-functional initiatives on AWS — and production AI systems with the evaluation, observability, and cost controls to operate them.</w:t>
       </w:r>
     </w:p>
     <w:p>
@@ -911,7 +911,7 @@
           <w:rtl w:val="0"/>
           <w:lang w:val="en-US"/>
         </w:rPr>
-        <w:t xml:space="preserve"> Agile, Scrum, Program Governance, Roadmap Execution, Release Planning, Release Management, RAID Management, Dependency Management, Stakeholder Management, Jira, Confluence, Notion, n8n</w:t>
+        <w:t xml:space="preserve"> Agile, Scrum, Program Governance, Roadmap Execution, Release Planning, Release Management, RAID Management, Dependency Management, Stakeholder Management</w:t>
       </w:r>
     </w:p>
     <w:p>
@@ -926,14 +926,14 @@
           <w:rtl w:val="0"/>
           <w:lang w:val="en-US"/>
         </w:rPr>
-        <w:t xml:space="preserve">Languages:</w:t>
-      </w:r>
-      <w:r>
-        <w:rPr>
-          <w:rtl w:val="0"/>
-          <w:lang w:val="en-US"/>
-        </w:rPr>
-        <w:t xml:space="preserve"> Python, Perl, Ruby, Bash</w:t>
+        <w:t xml:space="preserve">AI &amp; Agents:</w:t>
+      </w:r>
+      <w:r>
+        <w:rPr>
+          <w:rtl w:val="0"/>
+          <w:lang w:val="en-US"/>
+        </w:rPr>
+        <w:t xml:space="preserve"> Claude API, multi-agent orchestration, tool use, RAG, evals, cost telemetry</w:t>
       </w:r>
     </w:p>
     <w:p>
@@ -946,14 +946,16 @@
           <w:b w:val="1"/>
           <w:bCs w:val="1"/>
           <w:rtl w:val="0"/>
-        </w:rPr>
-        <w:t xml:space="preserve">Cloud &amp; Infrastructure:</w:t>
-      </w:r>
-      <w:r>
-        <w:rPr>
-          <w:rtl w:val="0"/>
-        </w:rPr>
-        <w:t xml:space="preserve"> AWS (ECS/Fargate, Lambda, SQS, EventBridge, SageMaker, S3, Athena, AWS SAM)</w:t>
+          <w:lang w:val="en-US"/>
+        </w:rPr>
+        <w:t xml:space="preserve">Languages:</w:t>
+      </w:r>
+      <w:r>
+        <w:rPr>
+          <w:rtl w:val="0"/>
+          <w:lang w:val="en-US"/>
+        </w:rPr>
+        <w:t xml:space="preserve"> Python, Perl, Ruby, Bash</w:t>
       </w:r>
     </w:p>
     <w:p>
@@ -966,16 +968,14 @@
           <w:b w:val="1"/>
           <w:bCs w:val="1"/>
           <w:rtl w:val="0"/>
-          <w:lang w:val="it-IT"/>
-        </w:rPr>
-        <w:t xml:space="preserve">Data:</w:t>
-      </w:r>
-      <w:r>
-        <w:rPr>
-          <w:rtl w:val="0"/>
-          <w:lang w:val="it-IT"/>
-        </w:rPr>
-        <w:t xml:space="preserve"> MySQL, PostgreSQL, ClickHouse, Hive, DynamoDB</w:t>
+        </w:rPr>
+        <w:t xml:space="preserve">Cloud &amp; Infrastructure:</w:t>
+      </w:r>
+      <w:r>
+        <w:rPr>
+          <w:rtl w:val="0"/>
+        </w:rPr>
+        <w:t xml:space="preserve"> AWS (ECS/Fargate, Lambda, SQS, EventBridge, SageMaker, S3, Athena, AWS SAM)</w:t>
       </w:r>
     </w:p>
     <w:p>
@@ -988,16 +988,16 @@
           <w:b w:val="1"/>
           <w:bCs w:val="1"/>
           <w:rtl w:val="0"/>
-          <w:lang w:val="en-US"/>
-        </w:rPr>
-        <w:t xml:space="preserve">Observability:</w:t>
-      </w:r>
-      <w:r>
-        <w:rPr>
-          <w:rtl w:val="0"/>
-          <w:lang w:val="en-US"/>
-        </w:rPr>
-        <w:t xml:space="preserve"> Datadog, Prometheus, Grafana, distributed tracing, structured logging</w:t>
+          <w:lang w:val="it-IT"/>
+        </w:rPr>
+        <w:t xml:space="preserve">Data:</w:t>
+      </w:r>
+      <w:r>
+        <w:rPr>
+          <w:rtl w:val="0"/>
+          <w:lang w:val="it-IT"/>
+        </w:rPr>
+        <w:t xml:space="preserve"> MySQL, PostgreSQL, ClickHouse, Hive, DynamoDB</w:t>
       </w:r>
     </w:p>
     <w:p>
@@ -1012,6 +1012,28 @@
           <w:rtl w:val="0"/>
           <w:lang w:val="en-US"/>
         </w:rPr>
+        <w:t xml:space="preserve">Observability:</w:t>
+      </w:r>
+      <w:r>
+        <w:rPr>
+          <w:rtl w:val="0"/>
+          <w:lang w:val="en-US"/>
+        </w:rPr>
+        <w:t xml:space="preserve"> Datadog, Prometheus, Grafana, distributed tracing, structured logging</w:t>
+      </w:r>
+    </w:p>
+    <w:p>
+      <w:pPr>
+        <w:pStyle w:val="Body"/>
+        <w:spacing w:after="20"/>
+      </w:pPr>
+      <w:r>
+        <w:rPr>
+          <w:b w:val="1"/>
+          <w:bCs w:val="1"/>
+          <w:rtl w:val="0"/>
+          <w:lang w:val="en-US"/>
+        </w:rPr>
         <w:t xml:space="preserve">Developer Tools:</w:t>
       </w:r>
       <w:r>
@@ -1019,7 +1041,7 @@
           <w:rtl w:val="0"/>
           <w:lang w:val="en-US"/>
         </w:rPr>
-        <w:t xml:space="preserve"> Git (GitHub, Bitbucket), Docker, Swagger/OpenAPI, Cursor</w:t>
+        <w:t xml:space="preserve"> Git (GitHub, Bitbucket), Docker, Swagger/OpenAPI, Cursor, Jira, Confluence, Notion, n8n</w:t>
       </w:r>
     </w:p>
     <w:p>

</xml_diff>